<commit_message>
KTLO contract: max 1 uur/week, remove technische schuld from exclusions
</commit_message>
<xml_diff>
--- a/artifacts/KTLO_Overeenkomst_Dienstverlening.docx
+++ b/artifacts/KTLO_Overeenkomst_Dienstverlening.docx
@@ -1866,7 +1866,7 @@
           <w:sz w:val="22"/>
           <w:szCs w:val="22"/>
         </w:rPr>
-        <w:t xml:space="preserve">De Diensten bedragen maximaal 4 uur per week gemiddeld over een kalendermaand. Opdrachtnemer is niet verplicht meer uren te besteden. Indien de Diensten structureel meer dan 4 uur per week vergen, is Artikel 5.3 van toepassing.</w:t>
+        <w:t xml:space="preserve">De Diensten bedragen maximaal 1 uur per week gemiddeld over een kalendermaand. Opdrachtnemer is niet verplicht meer uren te besteden. Indien de Diensten structureel meer dan 1 uur per week vergen, is Artikel 5.3 van toepassing.</w:t>
       </w:r>
     </w:p>
     <w:p>
@@ -2006,7 +2006,7 @@
           <w:sz w:val="22"/>
           <w:szCs w:val="22"/>
         </w:rPr>
-        <w:t xml:space="preserve">–  Refactoring, architectuurverbeteringen of technische schuld</w:t>
+        <w:t xml:space="preserve">–  Refactoring of architectuurverbeteringen</w:t>
       </w:r>
     </w:p>
     <w:p>
@@ -2973,7 +2973,7 @@
           <w:sz w:val="22"/>
           <w:szCs w:val="22"/>
         </w:rPr>
-        <w:t xml:space="preserve">Indien de Diensten gedurende drie opeenvolgende maanden structureel meer dan 4 uur per week vergen, heeft Opdrachtnemer het recht een redelijke vergoeding voor te stellen voor het meerdere. Partijen treden in dat geval in overleg. Komen Partijen niet tot overeenstemming binnen 30 dagen, dan is Opdrachtnemer gerechtigd de maximale inzet terug te brengen tot 4 uur per week of de overeenkomst op te zeggen met inachtneming van de opzegtermijn in Artikel 6.3.</w:t>
+        <w:t xml:space="preserve">Indien de Diensten gedurende drie opeenvolgende maanden structureel meer dan 1 uur per week vergen, heeft Opdrachtnemer het recht een redelijke vergoeding voor te stellen voor het meerdere. Partijen treden in dat geval in overleg. Komen Partijen niet tot overeenstemming binnen 30 dagen, dan is Opdrachtnemer gerechtigd de maximale inzet terug te brengen tot 1 uur per week of de overeenkomst op te zeggen met inachtneming van de opzegtermijn in Artikel 6.3.</w:t>
       </w:r>
     </w:p>
     <w:p>

</xml_diff>

<commit_message>
Add overweging E: KTLO-only afspraak meeting 11 feb 2026 bij Van der Meer
</commit_message>
<xml_diff>
--- a/artifacts/KTLO_Overeenkomst_Dienstverlening.docx
+++ b/artifacts/KTLO_Overeenkomst_Dienstverlening.docx
@@ -951,7 +951,7 @@
           <w:sz w:val="22"/>
           <w:szCs w:val="22"/>
         </w:rPr>
-        <w:t xml:space="preserve">Partijen wensen de voorwaarden vast te leggen waaronder Opdrachtnemer technische onderhoudsdiensten verricht om het Platform operationeel te houden (Keep The Lights On / KTLO).</w:t>
+        <w:t xml:space="preserve">Tijdens de bijeenkomst van 11 februari 2026 ten kantore van Van der Meer Accountants &amp; Consultants te Oosterwolde, in aanwezigheid van onder meer Douwine Koopman, Marlou Woltmeijer, Grady Hofstra en Klaas de Vries, zijn Partijen overeengekomen dat Peter Berkenbosch uitsluitend KTLO-werkzaamheden zal verrichten voor het Platform.</w:t>
       </w:r>
     </w:p>
     <w:p>
@@ -967,6 +967,29 @@
           <w:szCs w:val="22"/>
         </w:rPr>
         <w:t xml:space="preserve">F. </w:t>
+      </w:r>
+      <w:r>
+        <w:rPr>
+          <w:rFonts w:ascii="Arial" w:cs="Arial" w:eastAsia="Arial" w:hAnsi="Arial"/>
+          <w:sz w:val="22"/>
+          <w:szCs w:val="22"/>
+        </w:rPr>
+        <w:t xml:space="preserve">Partijen wensen de voorwaarden van deze KTLO-dienstverlening schriftelijk vast te leggen (Keep The Lights On / KTLO).</w:t>
+      </w:r>
+    </w:p>
+    <w:p>
+      <w:pPr>
+        <w:spacing w:before="100" w:after="100"/>
+      </w:pPr>
+      <w:r>
+        <w:rPr>
+          <w:rFonts w:ascii="Arial" w:cs="Arial" w:eastAsia="Arial" w:hAnsi="Arial"/>
+          <w:b/>
+          <w:bCs/>
+          <w:sz w:val="22"/>
+          <w:szCs w:val="22"/>
+        </w:rPr>
+        <w:t xml:space="preserve">G. </w:t>
       </w:r>
       <w:r>
         <w:rPr>

</xml_diff>

<commit_message>
Normalize capitalization: lowercase multi-word defined terms
Kritieke Bug → Kritieke bug, Security Patch → Security patch,
Werkzaamheden Buiten Scope → Werkzaamheden buiten scope.
</commit_message>
<xml_diff>
--- a/artifacts/KTLO_Overeenkomst_Dienstverlening.docx
+++ b/artifacts/KTLO_Overeenkomst_Dienstverlening.docx
@@ -1131,7 +1131,7 @@
           <w:sz w:val="22"/>
           <w:szCs w:val="22"/>
         </w:rPr>
-        <w:t xml:space="preserve">1.4 Kritieke Bug: </w:t>
+        <w:t xml:space="preserve">1.4 Kritieke bug: </w:t>
       </w:r>
       <w:r>
         <w:rPr>
@@ -1154,7 +1154,7 @@
           <w:sz w:val="22"/>
           <w:szCs w:val="22"/>
         </w:rPr>
-        <w:t xml:space="preserve">1.5 Security Patch: </w:t>
+        <w:t xml:space="preserve">1.5 Security patch: </w:t>
       </w:r>
       <w:r>
         <w:rPr>
@@ -1177,7 +1177,7 @@
           <w:sz w:val="22"/>
           <w:szCs w:val="22"/>
         </w:rPr>
-        <w:t xml:space="preserve">1.6 Werkzaamheden Buiten Scope: </w:t>
+        <w:t xml:space="preserve">1.6 Werkzaamheden buiten scope: </w:t>
       </w:r>
       <w:r>
         <w:rPr>
@@ -1327,7 +1327,7 @@
           <w:sz w:val="22"/>
           <w:szCs w:val="22"/>
         </w:rPr>
-        <w:t xml:space="preserve">(b) Kritieke Bugs</w:t>
+        <w:t xml:space="preserve">(b) Kritieke bugs</w:t>
       </w:r>
     </w:p>
     <w:p>
@@ -1341,7 +1341,7 @@
           <w:sz w:val="22"/>
           <w:szCs w:val="22"/>
         </w:rPr>
-        <w:t xml:space="preserve">–  Diagnose en herstel van Kritieke Bugs zoals gedefinieerd in Artikel 1.4</w:t>
+        <w:t xml:space="preserve">–  Diagnose en herstel van Kritieke bugs zoals gedefinieerd in Artikel 1.4</w:t>
       </w:r>
     </w:p>
     <w:p>
@@ -1369,7 +1369,7 @@
           <w:sz w:val="22"/>
           <w:szCs w:val="22"/>
         </w:rPr>
-        <w:t xml:space="preserve">(c) Security Patches</w:t>
+        <w:t xml:space="preserve">(c) Security patches</w:t>
       </w:r>
     </w:p>
     <w:p>
@@ -1383,7 +1383,7 @@
           <w:sz w:val="22"/>
           <w:szCs w:val="22"/>
         </w:rPr>
-        <w:t xml:space="preserve">–  Toepassen van Security Patches zoals gedefinieerd in Artikel 1.5</w:t>
+        <w:t xml:space="preserve">–  Toepassen van Security patches zoals gedefinieerd in Artikel 1.5</w:t>
       </w:r>
     </w:p>
     <w:p>
@@ -1710,7 +1710,7 @@
                 <w:sz w:val="20"/>
                 <w:szCs w:val="20"/>
               </w:rPr>
-              <w:t xml:space="preserve">Kritieke Bug</w:t>
+              <w:t xml:space="preserve">Kritieke bug</w:t>
             </w:r>
           </w:p>
         </w:tc>
@@ -1784,7 +1784,7 @@
                 <w:sz w:val="20"/>
                 <w:szCs w:val="20"/>
               </w:rPr>
-              <w:t xml:space="preserve">Security Patch</w:t>
+              <w:t xml:space="preserve">Security patch</w:t>
             </w:r>
           </w:p>
         </w:tc>
@@ -2015,7 +2015,7 @@
           <w:sz w:val="22"/>
           <w:szCs w:val="22"/>
         </w:rPr>
-        <w:t xml:space="preserve">–  Performance optimalisatie (tenzij sprake van een Kritieke Bug)</w:t>
+        <w:t xml:space="preserve">–  Performance optimalisatie (tenzij sprake van een Kritieke bug)</w:t>
       </w:r>
     </w:p>
     <w:p>
@@ -2129,7 +2129,7 @@
           <w:sz w:val="24"/>
           <w:szCs w:val="24"/>
         </w:rPr>
-        <w:t xml:space="preserve">Artikel 3 — Werkzaamheden Buiten Scope</w:t>
+        <w:t xml:space="preserve">Artikel 3 — Werkzaamheden buiten scope</w:t>
       </w:r>
     </w:p>
     <w:p>
@@ -2152,7 +2152,7 @@
           <w:sz w:val="22"/>
           <w:szCs w:val="22"/>
         </w:rPr>
-        <w:t xml:space="preserve">Werkzaamheden Buiten Scope worden uitsluitend verricht na voorafgaande schriftelijke offerte door Opdrachtnemer en schriftelijke goedkeuring door Opdrachtgever.</w:t>
+        <w:t xml:space="preserve">Werkzaamheden buiten scope worden uitsluitend verricht na voorafgaande schriftelijke offerte door Opdrachtnemer en schriftelijke goedkeuring door Opdrachtgever.</w:t>
       </w:r>
     </w:p>
     <w:p>
@@ -2175,7 +2175,7 @@
           <w:sz w:val="22"/>
           <w:szCs w:val="22"/>
         </w:rPr>
-        <w:t xml:space="preserve">Het uurtarief voor Werkzaamheden Buiten Scope bedraagt €125,00 exclusief BTW.</w:t>
+        <w:t xml:space="preserve">Het uurtarief voor Werkzaamheden buiten scope bedraagt €125,00 exclusief BTW.</w:t>
       </w:r>
     </w:p>
     <w:p>
@@ -2198,7 +2198,7 @@
           <w:sz w:val="22"/>
           <w:szCs w:val="22"/>
         </w:rPr>
-        <w:t xml:space="preserve">Opdrachtnemer factureert Werkzaamheden Buiten Scope maandelijks achteraf op basis van bestede uren.</w:t>
+        <w:t xml:space="preserve">Opdrachtnemer factureert Werkzaamheden buiten scope maandelijks achteraf op basis van bestede uren.</w:t>
       </w:r>
     </w:p>
     <w:p>
@@ -2221,7 +2221,7 @@
           <w:sz w:val="22"/>
           <w:szCs w:val="22"/>
         </w:rPr>
-        <w:t xml:space="preserve">Op Werkzaamheden Buiten Scope zijn de overige bepalingen van deze overeenkomst onverkort van toepassing, tenzij schriftelijk anders overeengekomen.</w:t>
+        <w:t xml:space="preserve">Op Werkzaamheden buiten scope zijn de overige bepalingen van deze overeenkomst onverkort van toepassing, tenzij schriftelijk anders overeengekomen.</w:t>
       </w:r>
     </w:p>
     <w:p>
@@ -2968,7 +2968,7 @@
           <w:sz w:val="22"/>
           <w:szCs w:val="22"/>
         </w:rPr>
-        <w:t xml:space="preserve">–  (b) vergoedingen voor Werkzaamheden Buiten Scope op grond van Artikel 3.</w:t>
+        <w:t xml:space="preserve">–  (b) vergoedingen voor Werkzaamheden buiten scope op grond van Artikel 3.</w:t>
       </w:r>
     </w:p>
     <w:p>

</xml_diff>

<commit_message>
Art. 8 IP: clarify ownership rests with Dinck B.V.
</commit_message>
<xml_diff>
--- a/artifacts/KTLO_Overeenkomst_Dienstverlening.docx
+++ b/artifacts/KTLO_Overeenkomst_Dienstverlening.docx
@@ -3240,7 +3240,7 @@
           <w:sz w:val="24"/>
           <w:szCs w:val="24"/>
         </w:rPr>
-        <w:t xml:space="preserve">Artikel 8 — Intellectueel Eigendom</w:t>
+        <w:t xml:space="preserve">Artikel 8 — Intellectueel eigendom</w:t>
       </w:r>
     </w:p>
     <w:p>
@@ -3255,20 +3255,20 @@
           <w:sz w:val="22"/>
           <w:szCs w:val="22"/>
         </w:rPr>
-        <w:t xml:space="preserve">8.1 Geen overdracht</w:t>
-      </w:r>
-    </w:p>
-    <w:p>
-      <w:pPr>
-        <w:spacing w:before="100" w:after="100"/>
-      </w:pPr>
-      <w:r>
-        <w:rPr>
-          <w:rFonts w:ascii="Arial" w:cs="Arial" w:eastAsia="Arial" w:hAnsi="Arial"/>
-          <w:sz w:val="22"/>
-          <w:szCs w:val="22"/>
-        </w:rPr>
-        <w:t xml:space="preserve">Door het verrichten van de Diensten vindt geen overdracht van intellectuele eigendomsrechten plaats. Alle bestaande intellectuele eigendomsrechten met betrekking tot het Platform, de broncode en de onderliggende technologie blijven berusten bij de huidige rechthebbende(n).</w:t>
+        <w:t xml:space="preserve">8.1 Eigendom</w:t>
+      </w:r>
+    </w:p>
+    <w:p>
+      <w:pPr>
+        <w:spacing w:before="100" w:after="100"/>
+      </w:pPr>
+      <w:r>
+        <w:rPr>
+          <w:rFonts w:ascii="Arial" w:cs="Arial" w:eastAsia="Arial" w:hAnsi="Arial"/>
+          <w:sz w:val="22"/>
+          <w:szCs w:val="22"/>
+        </w:rPr>
+        <w:t xml:space="preserve">Alle intellectuele eigendomsrechten met betrekking tot het Platform, de broncode en de onderliggende technologie berusten bij Opdrachtgever.</w:t>
       </w:r>
     </w:p>
     <w:p>
@@ -3283,20 +3283,20 @@
           <w:sz w:val="22"/>
           <w:szCs w:val="22"/>
         </w:rPr>
-        <w:t xml:space="preserve">8.2 Geen toegang broncode</w:t>
-      </w:r>
-    </w:p>
-    <w:p>
-      <w:pPr>
-        <w:spacing w:before="100" w:after="100"/>
-      </w:pPr>
-      <w:r>
-        <w:rPr>
-          <w:rFonts w:ascii="Arial" w:cs="Arial" w:eastAsia="Arial" w:hAnsi="Arial"/>
-          <w:sz w:val="22"/>
-          <w:szCs w:val="22"/>
-        </w:rPr>
-        <w:t xml:space="preserve">Deze overeenkomst verschaft Opdrachtgever geen recht op toegang tot, inzage in of een kopie van de broncode van het Platform. Toegang tot de broncode is geen onderdeel van de Diensten.</w:t>
+        <w:t xml:space="preserve">8.2 Geen overdracht door dienstverlening</w:t>
+      </w:r>
+    </w:p>
+    <w:p>
+      <w:pPr>
+        <w:spacing w:before="100" w:after="100"/>
+      </w:pPr>
+      <w:r>
+        <w:rPr>
+          <w:rFonts w:ascii="Arial" w:cs="Arial" w:eastAsia="Arial" w:hAnsi="Arial"/>
+          <w:sz w:val="22"/>
+          <w:szCs w:val="22"/>
+        </w:rPr>
+        <w:t xml:space="preserve">Door het verrichten van de Diensten vindt geen wijziging plaats in de bestaande eigendomsverhoudingen. Opdrachtnemer verkrijgt geen intellectuele eigendomsrechten op het Platform of enig onderdeel daarvan.</w:t>
       </w:r>
     </w:p>
     <w:p>
@@ -3311,20 +3311,20 @@
           <w:sz w:val="22"/>
           <w:szCs w:val="22"/>
         </w:rPr>
-        <w:t xml:space="preserve">8.3 Bestaande rechten</w:t>
-      </w:r>
-    </w:p>
-    <w:p>
-      <w:pPr>
-        <w:spacing w:before="100" w:after="100"/>
-      </w:pPr>
-      <w:r>
-        <w:rPr>
-          <w:rFonts w:ascii="Arial" w:cs="Arial" w:eastAsia="Arial" w:hAnsi="Arial"/>
-          <w:sz w:val="22"/>
-          <w:szCs w:val="22"/>
-        </w:rPr>
-        <w:t xml:space="preserve">Deze overeenkomst laat de bestaande eigendomsverhoudingen met betrekking tot het Platform onverlet. Niets in deze overeenkomst kan worden uitgelegd als een wijziging, afstand of overdracht van bestaande intellectuele eigendomsrechten.</w:t>
+        <w:t xml:space="preserve">8.3 Geen toegang broncode</w:t>
+      </w:r>
+    </w:p>
+    <w:p>
+      <w:pPr>
+        <w:spacing w:before="100" w:after="100"/>
+      </w:pPr>
+      <w:r>
+        <w:rPr>
+          <w:rFonts w:ascii="Arial" w:cs="Arial" w:eastAsia="Arial" w:hAnsi="Arial"/>
+          <w:sz w:val="22"/>
+          <w:szCs w:val="22"/>
+        </w:rPr>
+        <w:t xml:space="preserve">Deze overeenkomst verschaft Opdrachtgever geen aanvullend recht op toegang tot, inzage in of een kopie van de broncode van het Platform. Toegang tot de broncode is geen onderdeel van de Diensten.</w:t>
       </w:r>
     </w:p>
     <w:p>

</xml_diff>

<commit_message>
Remove Art. 8.3 source code access clause to avoid confusion
</commit_message>
<xml_diff>
--- a/artifacts/KTLO_Overeenkomst_Dienstverlening.docx
+++ b/artifacts/KTLO_Overeenkomst_Dienstverlening.docx
@@ -3297,34 +3297,6 @@
           <w:szCs w:val="22"/>
         </w:rPr>
         <w:t xml:space="preserve">Door het verrichten van de Diensten vindt geen wijziging plaats in de bestaande eigendomsverhoudingen. Opdrachtnemer verkrijgt geen intellectuele eigendomsrechten op het Platform of enig onderdeel daarvan.</w:t>
-      </w:r>
-    </w:p>
-    <w:p>
-      <w:pPr>
-        <w:spacing w:before="200" w:after="100"/>
-      </w:pPr>
-      <w:r>
-        <w:rPr>
-          <w:rFonts w:ascii="Arial" w:cs="Arial" w:eastAsia="Arial" w:hAnsi="Arial"/>
-          <w:b/>
-          <w:bCs/>
-          <w:sz w:val="22"/>
-          <w:szCs w:val="22"/>
-        </w:rPr>
-        <w:t xml:space="preserve">8.3 Geen toegang broncode</w:t>
-      </w:r>
-    </w:p>
-    <w:p>
-      <w:pPr>
-        <w:spacing w:before="100" w:after="100"/>
-      </w:pPr>
-      <w:r>
-        <w:rPr>
-          <w:rFonts w:ascii="Arial" w:cs="Arial" w:eastAsia="Arial" w:hAnsi="Arial"/>
-          <w:sz w:val="22"/>
-          <w:szCs w:val="22"/>
-        </w:rPr>
-        <w:t xml:space="preserve">Deze overeenkomst verschaft Opdrachtgever geen aanvullend recht op toegang tot, inzage in of een kopie van de broncode van het Platform. Toegang tot de broncode is geen onderdeel van de Diensten.</w:t>
       </w:r>
     </w:p>
     <w:p>

</xml_diff>

<commit_message>
Remove Art. 10.1 async-only communication restriction
</commit_message>
<xml_diff>
--- a/artifacts/KTLO_Overeenkomst_Dienstverlening.docx
+++ b/artifacts/KTLO_Overeenkomst_Dienstverlening.docx
@@ -3455,35 +3455,7 @@
           <w:sz w:val="22"/>
           <w:szCs w:val="22"/>
         </w:rPr>
-        <w:t xml:space="preserve">10.1 Asynchroon</w:t>
-      </w:r>
-    </w:p>
-    <w:p>
-      <w:pPr>
-        <w:spacing w:before="100" w:after="100"/>
-      </w:pPr>
-      <w:r>
-        <w:rPr>
-          <w:rFonts w:ascii="Arial" w:cs="Arial" w:eastAsia="Arial" w:hAnsi="Arial"/>
-          <w:sz w:val="22"/>
-          <w:szCs w:val="22"/>
-        </w:rPr>
-        <w:t xml:space="preserve">Alle communicatie met betrekking tot de Diensten vindt uitsluitend plaats via e-mail of Basecamp (asynchroon). Opdrachtnemer is niet telefonisch bereikbaar voor aangelegenheden die verband houden met deze overeenkomst.</w:t>
-      </w:r>
-    </w:p>
-    <w:p>
-      <w:pPr>
-        <w:spacing w:before="200" w:after="100"/>
-      </w:pPr>
-      <w:r>
-        <w:rPr>
-          <w:rFonts w:ascii="Arial" w:cs="Arial" w:eastAsia="Arial" w:hAnsi="Arial"/>
-          <w:b/>
-          <w:bCs/>
-          <w:sz w:val="22"/>
-          <w:szCs w:val="22"/>
-        </w:rPr>
-        <w:t xml:space="preserve">10.2 Contactgegevens</w:t>
+        <w:t xml:space="preserve">10.1 Contactgegevens</w:t>
       </w:r>
     </w:p>
     <w:p>
@@ -3687,7 +3659,7 @@
           <w:sz w:val="22"/>
           <w:szCs w:val="22"/>
         </w:rPr>
-        <w:t xml:space="preserve">10.3 Escalatieprotocol</w:t>
+        <w:t xml:space="preserve">10.2 Escalatieprotocol</w:t>
       </w:r>
     </w:p>
     <w:p>

</xml_diff>

<commit_message>
Replace SLA table with industry-standard P1-P4 priority levels
P1 Kritiek (1hr/4hr), P2 Hoog (4hr/8hr), P3 Medium (8hr/5d),
P4 Laag (2d/10d). Fix escalation protocol to align with priority
system. Classification determined by Opdrachtnemer.
</commit_message>
<xml_diff>
--- a/artifacts/KTLO_Overeenkomst_Dienstverlening.docx
+++ b/artifacts/KTLO_Overeenkomst_Dienstverlening.docx
@@ -1496,7 +1496,1008 @@
           <w:sz w:val="22"/>
           <w:szCs w:val="22"/>
         </w:rPr>
-        <w:t xml:space="preserve">2.2 Responstijden</w:t>
+        <w:t xml:space="preserve">2.2 Prioriteiten en responstijden</w:t>
+      </w:r>
+    </w:p>
+    <w:p>
+      <w:pPr>
+        <w:spacing w:before="100" w:after="100"/>
+      </w:pPr>
+      <w:r>
+        <w:rPr>
+          <w:rFonts w:ascii="Arial" w:cs="Arial" w:eastAsia="Arial" w:hAnsi="Arial"/>
+          <w:sz w:val="22"/>
+          <w:szCs w:val="22"/>
+        </w:rPr>
+        <w:t xml:space="preserve"/>
+      </w:r>
+    </w:p>
+    <w:tbl>
+      <w:tblPr>
+        <w:tblW w:type="auto" w:w="100"/>
+        <w:tblBorders>
+          <w:top w:val="single" w:color="auto" w:sz="4"/>
+          <w:left w:val="single" w:color="auto" w:sz="4"/>
+          <w:bottom w:val="single" w:color="auto" w:sz="4"/>
+          <w:right w:val="single" w:color="auto" w:sz="4"/>
+          <w:insideH w:val="single" w:color="auto" w:sz="4"/>
+          <w:insideV w:val="single" w:color="auto" w:sz="4"/>
+        </w:tblBorders>
+      </w:tblPr>
+      <w:tblGrid>
+        <w:gridCol w:w="1800"/>
+        <w:gridCol w:w="3200"/>
+        <w:gridCol w:w="2080"/>
+        <w:gridCol w:w="2280"/>
+      </w:tblGrid>
+      <w:tr>
+        <w:trPr>
+          <w:tblHeader/>
+        </w:trPr>
+        <w:tc>
+          <w:tcPr>
+            <w:tcW w:type="dxa" w:w="1800"/>
+            <w:tcBorders>
+              <w:top w:val="single" w:color="999999" w:sz="1"/>
+              <w:left w:val="single" w:color="999999" w:sz="1"/>
+              <w:bottom w:val="single" w:color="999999" w:sz="1"/>
+              <w:right w:val="single" w:color="999999" w:sz="1"/>
+            </w:tcBorders>
+            <w:shd w:fill="E8E8E8" w:val="clear"/>
+          </w:tcPr>
+          <w:p>
+            <w:pPr>
+              <w:spacing w:before="40" w:after="40"/>
+            </w:pPr>
+            <w:r>
+              <w:rPr>
+                <w:rFonts w:ascii="Arial" w:cs="Arial" w:eastAsia="Arial" w:hAnsi="Arial"/>
+                <w:b/>
+                <w:bCs/>
+                <w:sz w:val="20"/>
+                <w:szCs w:val="20"/>
+              </w:rPr>
+              <w:t xml:space="preserve">Prioriteit</w:t>
+            </w:r>
+          </w:p>
+        </w:tc>
+        <w:tc>
+          <w:tcPr>
+            <w:tcW w:type="dxa" w:w="3200"/>
+            <w:tcBorders>
+              <w:top w:val="single" w:color="999999" w:sz="1"/>
+              <w:left w:val="single" w:color="999999" w:sz="1"/>
+              <w:bottom w:val="single" w:color="999999" w:sz="1"/>
+              <w:right w:val="single" w:color="999999" w:sz="1"/>
+            </w:tcBorders>
+            <w:shd w:fill="E8E8E8" w:val="clear"/>
+          </w:tcPr>
+          <w:p>
+            <w:pPr>
+              <w:spacing w:before="40" w:after="40"/>
+            </w:pPr>
+            <w:r>
+              <w:rPr>
+                <w:rFonts w:ascii="Arial" w:cs="Arial" w:eastAsia="Arial" w:hAnsi="Arial"/>
+                <w:b/>
+                <w:bCs/>
+                <w:sz w:val="20"/>
+                <w:szCs w:val="20"/>
+              </w:rPr>
+              <w:t xml:space="preserve">Omschrijving</w:t>
+            </w:r>
+          </w:p>
+        </w:tc>
+        <w:tc>
+          <w:tcPr>
+            <w:tcW w:type="dxa" w:w="2080"/>
+            <w:tcBorders>
+              <w:top w:val="single" w:color="999999" w:sz="1"/>
+              <w:left w:val="single" w:color="999999" w:sz="1"/>
+              <w:bottom w:val="single" w:color="999999" w:sz="1"/>
+              <w:right w:val="single" w:color="999999" w:sz="1"/>
+            </w:tcBorders>
+            <w:shd w:fill="E8E8E8" w:val="clear"/>
+          </w:tcPr>
+          <w:p>
+            <w:pPr>
+              <w:spacing w:before="40" w:after="40"/>
+            </w:pPr>
+            <w:r>
+              <w:rPr>
+                <w:rFonts w:ascii="Arial" w:cs="Arial" w:eastAsia="Arial" w:hAnsi="Arial"/>
+                <w:b/>
+                <w:bCs/>
+                <w:sz w:val="20"/>
+                <w:szCs w:val="20"/>
+              </w:rPr>
+              <w:t xml:space="preserve">Reactietijd</w:t>
+            </w:r>
+          </w:p>
+        </w:tc>
+        <w:tc>
+          <w:tcPr>
+            <w:tcW w:type="dxa" w:w="2280"/>
+            <w:tcBorders>
+              <w:top w:val="single" w:color="999999" w:sz="1"/>
+              <w:left w:val="single" w:color="999999" w:sz="1"/>
+              <w:bottom w:val="single" w:color="999999" w:sz="1"/>
+              <w:right w:val="single" w:color="999999" w:sz="1"/>
+            </w:tcBorders>
+            <w:shd w:fill="E8E8E8" w:val="clear"/>
+          </w:tcPr>
+          <w:p>
+            <w:pPr>
+              <w:spacing w:before="40" w:after="40"/>
+            </w:pPr>
+            <w:r>
+              <w:rPr>
+                <w:rFonts w:ascii="Arial" w:cs="Arial" w:eastAsia="Arial" w:hAnsi="Arial"/>
+                <w:b/>
+                <w:bCs/>
+                <w:sz w:val="20"/>
+                <w:szCs w:val="20"/>
+              </w:rPr>
+              <w:t xml:space="preserve">Oplostijd</w:t>
+            </w:r>
+          </w:p>
+        </w:tc>
+      </w:tr>
+      <w:tr>
+        <w:tc>
+          <w:tcPr>
+            <w:tcW w:type="dxa" w:w="1800"/>
+            <w:tcBorders>
+              <w:top w:val="single" w:color="999999" w:sz="1"/>
+              <w:left w:val="single" w:color="999999" w:sz="1"/>
+              <w:bottom w:val="single" w:color="999999" w:sz="1"/>
+              <w:right w:val="single" w:color="999999" w:sz="1"/>
+            </w:tcBorders>
+          </w:tcPr>
+          <w:p>
+            <w:pPr>
+              <w:spacing w:before="40" w:after="40"/>
+            </w:pPr>
+            <w:r>
+              <w:rPr>
+                <w:rFonts w:ascii="Arial" w:cs="Arial" w:eastAsia="Arial" w:hAnsi="Arial"/>
+                <w:b/>
+                <w:bCs/>
+                <w:sz w:val="20"/>
+                <w:szCs w:val="20"/>
+              </w:rPr>
+              <w:t xml:space="preserve">P1 — Kritiek</w:t>
+            </w:r>
+          </w:p>
+        </w:tc>
+        <w:tc>
+          <w:tcPr>
+            <w:tcW w:type="dxa" w:w="3200"/>
+            <w:tcBorders>
+              <w:top w:val="single" w:color="999999" w:sz="1"/>
+              <w:left w:val="single" w:color="999999" w:sz="1"/>
+              <w:bottom w:val="single" w:color="999999" w:sz="1"/>
+              <w:right w:val="single" w:color="999999" w:sz="1"/>
+            </w:tcBorders>
+          </w:tcPr>
+          <w:p>
+            <w:pPr>
+              <w:spacing w:before="40" w:after="40"/>
+            </w:pPr>
+            <w:r>
+              <w:rPr>
+                <w:rFonts w:ascii="Arial" w:cs="Arial" w:eastAsia="Arial" w:hAnsi="Arial"/>
+                <w:sz w:val="20"/>
+                <w:szCs w:val="20"/>
+              </w:rPr>
+              <w:t xml:space="preserve">Platform onbereikbaar, dataverlies, actief security-misbruik</w:t>
+            </w:r>
+          </w:p>
+        </w:tc>
+        <w:tc>
+          <w:tcPr>
+            <w:tcW w:type="dxa" w:w="2080"/>
+            <w:tcBorders>
+              <w:top w:val="single" w:color="999999" w:sz="1"/>
+              <w:left w:val="single" w:color="999999" w:sz="1"/>
+              <w:bottom w:val="single" w:color="999999" w:sz="1"/>
+              <w:right w:val="single" w:color="999999" w:sz="1"/>
+            </w:tcBorders>
+          </w:tcPr>
+          <w:p>
+            <w:pPr>
+              <w:spacing w:before="40" w:after="40"/>
+            </w:pPr>
+            <w:r>
+              <w:rPr>
+                <w:rFonts w:ascii="Arial" w:cs="Arial" w:eastAsia="Arial" w:hAnsi="Arial"/>
+                <w:sz w:val="20"/>
+                <w:szCs w:val="20"/>
+              </w:rPr>
+              <w:t xml:space="preserve">1 uur</w:t>
+            </w:r>
+          </w:p>
+        </w:tc>
+        <w:tc>
+          <w:tcPr>
+            <w:tcW w:type="dxa" w:w="2280"/>
+            <w:tcBorders>
+              <w:top w:val="single" w:color="999999" w:sz="1"/>
+              <w:left w:val="single" w:color="999999" w:sz="1"/>
+              <w:bottom w:val="single" w:color="999999" w:sz="1"/>
+              <w:right w:val="single" w:color="999999" w:sz="1"/>
+            </w:tcBorders>
+          </w:tcPr>
+          <w:p>
+            <w:pPr>
+              <w:spacing w:before="40" w:after="40"/>
+            </w:pPr>
+            <w:r>
+              <w:rPr>
+                <w:rFonts w:ascii="Arial" w:cs="Arial" w:eastAsia="Arial" w:hAnsi="Arial"/>
+                <w:sz w:val="20"/>
+                <w:szCs w:val="20"/>
+              </w:rPr>
+              <w:t xml:space="preserve">4 uur</w:t>
+            </w:r>
+          </w:p>
+        </w:tc>
+      </w:tr>
+      <w:tr>
+        <w:tc>
+          <w:tcPr>
+            <w:tcW w:type="dxa" w:w="1800"/>
+            <w:tcBorders>
+              <w:top w:val="single" w:color="999999" w:sz="1"/>
+              <w:left w:val="single" w:color="999999" w:sz="1"/>
+              <w:bottom w:val="single" w:color="999999" w:sz="1"/>
+              <w:right w:val="single" w:color="999999" w:sz="1"/>
+            </w:tcBorders>
+          </w:tcPr>
+          <w:p>
+            <w:pPr>
+              <w:spacing w:before="40" w:after="40"/>
+            </w:pPr>
+            <w:r>
+              <w:rPr>
+                <w:rFonts w:ascii="Arial" w:cs="Arial" w:eastAsia="Arial" w:hAnsi="Arial"/>
+                <w:b/>
+                <w:bCs/>
+                <w:sz w:val="20"/>
+                <w:szCs w:val="20"/>
+              </w:rPr>
+              <w:t xml:space="preserve">P2 — Hoog</w:t>
+            </w:r>
+          </w:p>
+        </w:tc>
+        <w:tc>
+          <w:tcPr>
+            <w:tcW w:type="dxa" w:w="3200"/>
+            <w:tcBorders>
+              <w:top w:val="single" w:color="999999" w:sz="1"/>
+              <w:left w:val="single" w:color="999999" w:sz="1"/>
+              <w:bottom w:val="single" w:color="999999" w:sz="1"/>
+              <w:right w:val="single" w:color="999999" w:sz="1"/>
+            </w:tcBorders>
+          </w:tcPr>
+          <w:p>
+            <w:pPr>
+              <w:spacing w:before="40" w:after="40"/>
+            </w:pPr>
+            <w:r>
+              <w:rPr>
+                <w:rFonts w:ascii="Arial" w:cs="Arial" w:eastAsia="Arial" w:hAnsi="Arial"/>
+                <w:sz w:val="20"/>
+                <w:szCs w:val="20"/>
+              </w:rPr>
+              <w:t xml:space="preserve">Kritieke bug (Art. 1.4), ernstige functieverstoring</w:t>
+            </w:r>
+          </w:p>
+        </w:tc>
+        <w:tc>
+          <w:tcPr>
+            <w:tcW w:type="dxa" w:w="2080"/>
+            <w:tcBorders>
+              <w:top w:val="single" w:color="999999" w:sz="1"/>
+              <w:left w:val="single" w:color="999999" w:sz="1"/>
+              <w:bottom w:val="single" w:color="999999" w:sz="1"/>
+              <w:right w:val="single" w:color="999999" w:sz="1"/>
+            </w:tcBorders>
+          </w:tcPr>
+          <w:p>
+            <w:pPr>
+              <w:spacing w:before="40" w:after="40"/>
+            </w:pPr>
+            <w:r>
+              <w:rPr>
+                <w:rFonts w:ascii="Arial" w:cs="Arial" w:eastAsia="Arial" w:hAnsi="Arial"/>
+                <w:sz w:val="20"/>
+                <w:szCs w:val="20"/>
+              </w:rPr>
+              <w:t xml:space="preserve">4 uur</w:t>
+            </w:r>
+          </w:p>
+        </w:tc>
+        <w:tc>
+          <w:tcPr>
+            <w:tcW w:type="dxa" w:w="2280"/>
+            <w:tcBorders>
+              <w:top w:val="single" w:color="999999" w:sz="1"/>
+              <w:left w:val="single" w:color="999999" w:sz="1"/>
+              <w:bottom w:val="single" w:color="999999" w:sz="1"/>
+              <w:right w:val="single" w:color="999999" w:sz="1"/>
+            </w:tcBorders>
+          </w:tcPr>
+          <w:p>
+            <w:pPr>
+              <w:spacing w:before="40" w:after="40"/>
+            </w:pPr>
+            <w:r>
+              <w:rPr>
+                <w:rFonts w:ascii="Arial" w:cs="Arial" w:eastAsia="Arial" w:hAnsi="Arial"/>
+                <w:sz w:val="20"/>
+                <w:szCs w:val="20"/>
+              </w:rPr>
+              <w:t xml:space="preserve">8 uur</w:t>
+            </w:r>
+          </w:p>
+        </w:tc>
+      </w:tr>
+      <w:tr>
+        <w:tc>
+          <w:tcPr>
+            <w:tcW w:type="dxa" w:w="1800"/>
+            <w:tcBorders>
+              <w:top w:val="single" w:color="999999" w:sz="1"/>
+              <w:left w:val="single" w:color="999999" w:sz="1"/>
+              <w:bottom w:val="single" w:color="999999" w:sz="1"/>
+              <w:right w:val="single" w:color="999999" w:sz="1"/>
+            </w:tcBorders>
+          </w:tcPr>
+          <w:p>
+            <w:pPr>
+              <w:spacing w:before="40" w:after="40"/>
+            </w:pPr>
+            <w:r>
+              <w:rPr>
+                <w:rFonts w:ascii="Arial" w:cs="Arial" w:eastAsia="Arial" w:hAnsi="Arial"/>
+                <w:b/>
+                <w:bCs/>
+                <w:sz w:val="20"/>
+                <w:szCs w:val="20"/>
+              </w:rPr>
+              <w:t xml:space="preserve">P3 — Medium</w:t>
+            </w:r>
+          </w:p>
+        </w:tc>
+        <w:tc>
+          <w:tcPr>
+            <w:tcW w:type="dxa" w:w="3200"/>
+            <w:tcBorders>
+              <w:top w:val="single" w:color="999999" w:sz="1"/>
+              <w:left w:val="single" w:color="999999" w:sz="1"/>
+              <w:bottom w:val="single" w:color="999999" w:sz="1"/>
+              <w:right w:val="single" w:color="999999" w:sz="1"/>
+            </w:tcBorders>
+          </w:tcPr>
+          <w:p>
+            <w:pPr>
+              <w:spacing w:before="40" w:after="40"/>
+            </w:pPr>
+            <w:r>
+              <w:rPr>
+                <w:rFonts w:ascii="Arial" w:cs="Arial" w:eastAsia="Arial" w:hAnsi="Arial"/>
+                <w:sz w:val="20"/>
+                <w:szCs w:val="20"/>
+              </w:rPr>
+              <w:t xml:space="preserve">Security patch (Art. 1.5), gedeeltelijke functieverstoring</w:t>
+            </w:r>
+          </w:p>
+        </w:tc>
+        <w:tc>
+          <w:tcPr>
+            <w:tcW w:type="dxa" w:w="2080"/>
+            <w:tcBorders>
+              <w:top w:val="single" w:color="999999" w:sz="1"/>
+              <w:left w:val="single" w:color="999999" w:sz="1"/>
+              <w:bottom w:val="single" w:color="999999" w:sz="1"/>
+              <w:right w:val="single" w:color="999999" w:sz="1"/>
+            </w:tcBorders>
+          </w:tcPr>
+          <w:p>
+            <w:pPr>
+              <w:spacing w:before="40" w:after="40"/>
+            </w:pPr>
+            <w:r>
+              <w:rPr>
+                <w:rFonts w:ascii="Arial" w:cs="Arial" w:eastAsia="Arial" w:hAnsi="Arial"/>
+                <w:sz w:val="20"/>
+                <w:szCs w:val="20"/>
+              </w:rPr>
+              <w:t xml:space="preserve">8 werkuren</w:t>
+            </w:r>
+          </w:p>
+        </w:tc>
+        <w:tc>
+          <w:tcPr>
+            <w:tcW w:type="dxa" w:w="2280"/>
+            <w:tcBorders>
+              <w:top w:val="single" w:color="999999" w:sz="1"/>
+              <w:left w:val="single" w:color="999999" w:sz="1"/>
+              <w:bottom w:val="single" w:color="999999" w:sz="1"/>
+              <w:right w:val="single" w:color="999999" w:sz="1"/>
+            </w:tcBorders>
+          </w:tcPr>
+          <w:p>
+            <w:pPr>
+              <w:spacing w:before="40" w:after="40"/>
+            </w:pPr>
+            <w:r>
+              <w:rPr>
+                <w:rFonts w:ascii="Arial" w:cs="Arial" w:eastAsia="Arial" w:hAnsi="Arial"/>
+                <w:sz w:val="20"/>
+                <w:szCs w:val="20"/>
+              </w:rPr>
+              <w:t xml:space="preserve">5 werkdagen</w:t>
+            </w:r>
+          </w:p>
+        </w:tc>
+      </w:tr>
+      <w:tr>
+        <w:tc>
+          <w:tcPr>
+            <w:tcW w:type="dxa" w:w="1800"/>
+            <w:tcBorders>
+              <w:top w:val="single" w:color="999999" w:sz="1"/>
+              <w:left w:val="single" w:color="999999" w:sz="1"/>
+              <w:bottom w:val="single" w:color="999999" w:sz="1"/>
+              <w:right w:val="single" w:color="999999" w:sz="1"/>
+            </w:tcBorders>
+          </w:tcPr>
+          <w:p>
+            <w:pPr>
+              <w:spacing w:before="40" w:after="40"/>
+            </w:pPr>
+            <w:r>
+              <w:rPr>
+                <w:rFonts w:ascii="Arial" w:cs="Arial" w:eastAsia="Arial" w:hAnsi="Arial"/>
+                <w:b/>
+                <w:bCs/>
+                <w:sz w:val="20"/>
+                <w:szCs w:val="20"/>
+              </w:rPr>
+              <w:t xml:space="preserve">P4 — Laag</w:t>
+            </w:r>
+          </w:p>
+        </w:tc>
+        <w:tc>
+          <w:tcPr>
+            <w:tcW w:type="dxa" w:w="3200"/>
+            <w:tcBorders>
+              <w:top w:val="single" w:color="999999" w:sz="1"/>
+              <w:left w:val="single" w:color="999999" w:sz="1"/>
+              <w:bottom w:val="single" w:color="999999" w:sz="1"/>
+              <w:right w:val="single" w:color="999999" w:sz="1"/>
+            </w:tcBorders>
+          </w:tcPr>
+          <w:p>
+            <w:pPr>
+              <w:spacing w:before="40" w:after="40"/>
+            </w:pPr>
+            <w:r>
+              <w:rPr>
+                <w:rFonts w:ascii="Arial" w:cs="Arial" w:eastAsia="Arial" w:hAnsi="Arial"/>
+                <w:sz w:val="20"/>
+                <w:szCs w:val="20"/>
+              </w:rPr>
+              <w:t xml:space="preserve">Standaard onderhoud, certificaten, backup-verificatie</w:t>
+            </w:r>
+          </w:p>
+        </w:tc>
+        <w:tc>
+          <w:tcPr>
+            <w:tcW w:type="dxa" w:w="2080"/>
+            <w:tcBorders>
+              <w:top w:val="single" w:color="999999" w:sz="1"/>
+              <w:left w:val="single" w:color="999999" w:sz="1"/>
+              <w:bottom w:val="single" w:color="999999" w:sz="1"/>
+              <w:right w:val="single" w:color="999999" w:sz="1"/>
+            </w:tcBorders>
+          </w:tcPr>
+          <w:p>
+            <w:pPr>
+              <w:spacing w:before="40" w:after="40"/>
+            </w:pPr>
+            <w:r>
+              <w:rPr>
+                <w:rFonts w:ascii="Arial" w:cs="Arial" w:eastAsia="Arial" w:hAnsi="Arial"/>
+                <w:sz w:val="20"/>
+                <w:szCs w:val="20"/>
+              </w:rPr>
+              <w:t xml:space="preserve">2 werkdagen</w:t>
+            </w:r>
+          </w:p>
+        </w:tc>
+        <w:tc>
+          <w:tcPr>
+            <w:tcW w:type="dxa" w:w="2280"/>
+            <w:tcBorders>
+              <w:top w:val="single" w:color="999999" w:sz="1"/>
+              <w:left w:val="single" w:color="999999" w:sz="1"/>
+              <w:bottom w:val="single" w:color="999999" w:sz="1"/>
+              <w:right w:val="single" w:color="999999" w:sz="1"/>
+            </w:tcBorders>
+          </w:tcPr>
+          <w:p>
+            <w:pPr>
+              <w:spacing w:before="40" w:after="40"/>
+            </w:pPr>
+            <w:r>
+              <w:rPr>
+                <w:rFonts w:ascii="Arial" w:cs="Arial" w:eastAsia="Arial" w:hAnsi="Arial"/>
+                <w:sz w:val="20"/>
+                <w:szCs w:val="20"/>
+              </w:rPr>
+              <w:t xml:space="preserve">10 werkdagen</w:t>
+            </w:r>
+          </w:p>
+        </w:tc>
+      </w:tr>
+    </w:tbl>
+    <w:p>
+      <w:pPr>
+        <w:spacing w:before="100" w:after="100"/>
+      </w:pPr>
+      <w:r>
+        <w:rPr>
+          <w:rFonts w:ascii="Arial" w:cs="Arial" w:eastAsia="Arial" w:hAnsi="Arial"/>
+          <w:sz w:val="22"/>
+          <w:szCs w:val="22"/>
+        </w:rPr>
+        <w:t xml:space="preserve"/>
+      </w:r>
+    </w:p>
+    <w:p>
+      <w:pPr>
+        <w:spacing w:before="100" w:after="100"/>
+      </w:pPr>
+      <w:r>
+        <w:rPr>
+          <w:rFonts w:ascii="Arial" w:cs="Arial" w:eastAsia="Arial" w:hAnsi="Arial"/>
+          <w:sz w:val="22"/>
+          <w:szCs w:val="22"/>
+        </w:rPr>
+        <w:t xml:space="preserve">Werktijden: maandag t/m vrijdag, 9:00-17:00 CET. Reactie- en oplostijden worden gemeten in werkuren respectievelijk werkdagen, tenzij anders vermeld. Meldingen buiten werktijden worden geacht te zijn ontvangen bij aanvang van de eerstvolgende werkdag.</w:t>
+      </w:r>
+    </w:p>
+    <w:p>
+      <w:pPr>
+        <w:spacing w:before="100" w:after="100"/>
+      </w:pPr>
+      <w:r>
+        <w:rPr>
+          <w:rFonts w:ascii="Arial" w:cs="Arial" w:eastAsia="Arial" w:hAnsi="Arial"/>
+          <w:sz w:val="22"/>
+          <w:szCs w:val="22"/>
+        </w:rPr>
+        <w:t xml:space="preserve"/>
+      </w:r>
+    </w:p>
+    <w:p>
+      <w:pPr>
+        <w:spacing w:before="100" w:after="100"/>
+      </w:pPr>
+      <w:r>
+        <w:rPr>
+          <w:rFonts w:ascii="Arial" w:cs="Arial" w:eastAsia="Arial" w:hAnsi="Arial"/>
+          <w:sz w:val="22"/>
+          <w:szCs w:val="22"/>
+        </w:rPr>
+        <w:t xml:space="preserve">De classificatie van prioriteit wordt bepaald door Opdrachtnemer.</w:t>
+      </w:r>
+    </w:p>
+    <w:p>
+      <w:pPr>
+        <w:spacing w:before="200" w:after="100"/>
+      </w:pPr>
+      <w:r>
+        <w:rPr>
+          <w:rFonts w:ascii="Arial" w:cs="Arial" w:eastAsia="Arial" w:hAnsi="Arial"/>
+          <w:b/>
+          <w:bCs/>
+          <w:sz w:val="22"/>
+          <w:szCs w:val="22"/>
+        </w:rPr>
+        <w:t xml:space="preserve">2.3 Maximale inzet</w:t>
+      </w:r>
+    </w:p>
+    <w:p>
+      <w:pPr>
+        <w:spacing w:before="100" w:after="100"/>
+      </w:pPr>
+      <w:r>
+        <w:rPr>
+          <w:rFonts w:ascii="Arial" w:cs="Arial" w:eastAsia="Arial" w:hAnsi="Arial"/>
+          <w:sz w:val="22"/>
+          <w:szCs w:val="22"/>
+        </w:rPr>
+        <w:t xml:space="preserve">De Diensten bedragen maximaal 1 uur per week gemiddeld over een kalendermaand. Opdrachtnemer is niet verplicht meer uren te besteden. Indien de Diensten structureel meer dan 1 uur per week vergen, is Artikel 5.3 van toepassing.</w:t>
+      </w:r>
+    </w:p>
+    <w:p>
+      <w:pPr>
+        <w:spacing w:before="200" w:after="100"/>
+      </w:pPr>
+      <w:r>
+        <w:rPr>
+          <w:rFonts w:ascii="Arial" w:cs="Arial" w:eastAsia="Arial" w:hAnsi="Arial"/>
+          <w:b/>
+          <w:bCs/>
+          <w:sz w:val="22"/>
+          <w:szCs w:val="22"/>
+        </w:rPr>
+        <w:t xml:space="preserve">2.4 Uitsluitingen</w:t>
+      </w:r>
+    </w:p>
+    <w:p>
+      <w:pPr>
+        <w:spacing w:before="100" w:after="100"/>
+      </w:pPr>
+      <w:r>
+        <w:rPr>
+          <w:rFonts w:ascii="Arial" w:cs="Arial" w:eastAsia="Arial" w:hAnsi="Arial"/>
+          <w:sz w:val="22"/>
+          <w:szCs w:val="22"/>
+        </w:rPr>
+        <w:t xml:space="preserve">De volgende werkzaamheden vallen uitdrukkelijk niet onder de Diensten:</w:t>
+      </w:r>
+    </w:p>
+    <w:p>
+      <w:pPr>
+        <w:spacing w:before="60" w:after="60"/>
+        <w:ind w:left="720"/>
+      </w:pPr>
+      <w:r>
+        <w:rPr>
+          <w:rFonts w:ascii="Arial" w:cs="Arial" w:eastAsia="Arial" w:hAnsi="Arial"/>
+          <w:sz w:val="22"/>
+          <w:szCs w:val="22"/>
+        </w:rPr>
+        <w:t xml:space="preserve">–  Eindgebruiker support, training of onboarding</w:t>
+      </w:r>
+    </w:p>
+    <w:p>
+      <w:pPr>
+        <w:spacing w:before="60" w:after="60"/>
+        <w:ind w:left="720"/>
+      </w:pPr>
+      <w:r>
+        <w:rPr>
+          <w:rFonts w:ascii="Arial" w:cs="Arial" w:eastAsia="Arial" w:hAnsi="Arial"/>
+          <w:sz w:val="22"/>
+          <w:szCs w:val="22"/>
+        </w:rPr>
+        <w:t xml:space="preserve">–  Nieuwe functionaliteit of feature requests</w:t>
+      </w:r>
+    </w:p>
+    <w:p>
+      <w:pPr>
+        <w:spacing w:before="60" w:after="60"/>
+        <w:ind w:left="720"/>
+      </w:pPr>
+      <w:r>
+        <w:rPr>
+          <w:rFonts w:ascii="Arial" w:cs="Arial" w:eastAsia="Arial" w:hAnsi="Arial"/>
+          <w:sz w:val="22"/>
+          <w:szCs w:val="22"/>
+        </w:rPr>
+        <w:t xml:space="preserve">–  Uitbreidingen van bestaande functionaliteit</w:t>
+      </w:r>
+    </w:p>
+    <w:p>
+      <w:pPr>
+        <w:spacing w:before="60" w:after="60"/>
+        <w:ind w:left="720"/>
+      </w:pPr>
+      <w:r>
+        <w:rPr>
+          <w:rFonts w:ascii="Arial" w:cs="Arial" w:eastAsia="Arial" w:hAnsi="Arial"/>
+          <w:sz w:val="22"/>
+          <w:szCs w:val="22"/>
+        </w:rPr>
+        <w:t xml:space="preserve">–  Integraties met externe systemen (inclusief maar niet beperkt tot SpiekR)</w:t>
+      </w:r>
+    </w:p>
+    <w:p>
+      <w:pPr>
+        <w:spacing w:before="60" w:after="60"/>
+        <w:ind w:left="720"/>
+      </w:pPr>
+      <w:r>
+        <w:rPr>
+          <w:rFonts w:ascii="Arial" w:cs="Arial" w:eastAsia="Arial" w:hAnsi="Arial"/>
+          <w:sz w:val="22"/>
+          <w:szCs w:val="22"/>
+        </w:rPr>
+        <w:t xml:space="preserve">–  Mobile applicaties (inclusief maar niet beperkt tot Dinckly iOS)</w:t>
+      </w:r>
+    </w:p>
+    <w:p>
+      <w:pPr>
+        <w:spacing w:before="60" w:after="60"/>
+        <w:ind w:left="720"/>
+      </w:pPr>
+      <w:r>
+        <w:rPr>
+          <w:rFonts w:ascii="Arial" w:cs="Arial" w:eastAsia="Arial" w:hAnsi="Arial"/>
+          <w:sz w:val="22"/>
+          <w:szCs w:val="22"/>
+        </w:rPr>
+        <w:t xml:space="preserve">–  UI/UX verbeteringen of design updates</w:t>
+      </w:r>
+    </w:p>
+    <w:p>
+      <w:pPr>
+        <w:spacing w:before="60" w:after="60"/>
+        <w:ind w:left="720"/>
+      </w:pPr>
+      <w:r>
+        <w:rPr>
+          <w:rFonts w:ascii="Arial" w:cs="Arial" w:eastAsia="Arial" w:hAnsi="Arial"/>
+          <w:sz w:val="22"/>
+          <w:szCs w:val="22"/>
+        </w:rPr>
+        <w:t xml:space="preserve">–  Performance optimalisatie (tenzij sprake van een Kritieke bug)</w:t>
+      </w:r>
+    </w:p>
+    <w:p>
+      <w:pPr>
+        <w:spacing w:before="60" w:after="60"/>
+        <w:ind w:left="720"/>
+      </w:pPr>
+      <w:r>
+        <w:rPr>
+          <w:rFonts w:ascii="Arial" w:cs="Arial" w:eastAsia="Arial" w:hAnsi="Arial"/>
+          <w:sz w:val="22"/>
+          <w:szCs w:val="22"/>
+        </w:rPr>
+        <w:t xml:space="preserve">–  Refactoring of architectuurverbeteringen</w:t>
+      </w:r>
+    </w:p>
+    <w:p>
+      <w:pPr>
+        <w:spacing w:before="60" w:after="60"/>
+        <w:ind w:left="720"/>
+      </w:pPr>
+      <w:r>
+        <w:rPr>
+          <w:rFonts w:ascii="Arial" w:cs="Arial" w:eastAsia="Arial" w:hAnsi="Arial"/>
+          <w:sz w:val="22"/>
+          <w:szCs w:val="22"/>
+        </w:rPr>
+        <w:t xml:space="preserve">–  Niet-kritieke bugs (cosmetische issues, minor usability problemen, edge cases)</w:t>
+      </w:r>
+    </w:p>
+    <w:p>
+      <w:pPr>
+        <w:spacing w:before="60" w:after="60"/>
+        <w:ind w:left="720"/>
+      </w:pPr>
+      <w:r>
+        <w:rPr>
+          <w:rFonts w:ascii="Arial" w:cs="Arial" w:eastAsia="Arial" w:hAnsi="Arial"/>
+          <w:sz w:val="22"/>
+          <w:szCs w:val="22"/>
+        </w:rPr>
+        <w:t xml:space="preserve">–  Documentatie updates</w:t>
+      </w:r>
+    </w:p>
+    <w:p>
+      <w:pPr>
+        <w:spacing w:before="60" w:after="60"/>
+        <w:ind w:left="720"/>
+      </w:pPr>
+      <w:r>
+        <w:rPr>
+          <w:rFonts w:ascii="Arial" w:cs="Arial" w:eastAsia="Arial" w:hAnsi="Arial"/>
+          <w:sz w:val="22"/>
+          <w:szCs w:val="22"/>
+        </w:rPr>
+        <w:t xml:space="preserve">–  Database optimalisatie (niet-kritiek)</w:t>
+      </w:r>
+    </w:p>
+    <w:p>
+      <w:pPr>
+        <w:spacing w:before="60" w:after="60"/>
+        <w:ind w:left="720"/>
+      </w:pPr>
+      <w:r>
+        <w:rPr>
+          <w:rFonts w:ascii="Arial" w:cs="Arial" w:eastAsia="Arial" w:hAnsi="Arial"/>
+          <w:sz w:val="22"/>
+          <w:szCs w:val="22"/>
+        </w:rPr>
+        <w:t xml:space="preserve">–  Caching implementaties</w:t>
+      </w:r>
+    </w:p>
+    <w:p>
+      <w:pPr>
+        <w:spacing w:before="100" w:after="100"/>
+      </w:pPr>
+      <w:r>
+        <w:rPr>
+          <w:rFonts w:ascii="Arial" w:cs="Arial" w:eastAsia="Arial" w:hAnsi="Arial"/>
+          <w:sz w:val="22"/>
+          <w:szCs w:val="22"/>
+        </w:rPr>
+        <w:t xml:space="preserve"/>
+      </w:r>
+    </w:p>
+    <w:p>
+      <w:pPr>
+        <w:spacing w:before="100" w:after="100"/>
+      </w:pPr>
+      <w:r>
+        <w:rPr>
+          <w:rFonts w:ascii="Arial" w:cs="Arial" w:eastAsia="Arial" w:hAnsi="Arial"/>
+          <w:i/>
+          <w:iCs/>
+          <w:sz w:val="22"/>
+          <w:szCs w:val="22"/>
+        </w:rPr>
+        <w:t xml:space="preserve">Bij twijfel over de classificatie van een verzoek beslist Opdrachtnemer.</w:t>
+      </w:r>
+    </w:p>
+    <w:p>
+      <w:pPr>
+        <w:pStyle w:val="Heading1"/>
+        <w:spacing w:before="400" w:after="150"/>
+      </w:pPr>
+      <w:r>
+        <w:rPr>
+          <w:rFonts w:ascii="Arial" w:cs="Arial" w:eastAsia="Arial" w:hAnsi="Arial"/>
+          <w:b/>
+          <w:bCs/>
+          <w:sz w:val="24"/>
+          <w:szCs w:val="24"/>
+        </w:rPr>
+        <w:t xml:space="preserve">Artikel 3 — Werkzaamheden buiten scope</w:t>
+      </w:r>
+    </w:p>
+    <w:p>
+      <w:pPr>
+        <w:spacing w:before="100" w:after="100"/>
+      </w:pPr>
+      <w:r>
+        <w:rPr>
+          <w:rFonts w:ascii="Arial" w:cs="Arial" w:eastAsia="Arial" w:hAnsi="Arial"/>
+          <w:b/>
+          <w:bCs/>
+          <w:sz w:val="22"/>
+          <w:szCs w:val="22"/>
+        </w:rPr>
+        <w:t xml:space="preserve">3.1 </w:t>
+      </w:r>
+      <w:r>
+        <w:rPr>
+          <w:rFonts w:ascii="Arial" w:cs="Arial" w:eastAsia="Arial" w:hAnsi="Arial"/>
+          <w:sz w:val="22"/>
+          <w:szCs w:val="22"/>
+        </w:rPr>
+        <w:t xml:space="preserve">Werkzaamheden buiten scope worden uitsluitend verricht na voorafgaande schriftelijke offerte door Opdrachtnemer en schriftelijke goedkeuring door Opdrachtgever.</w:t>
+      </w:r>
+    </w:p>
+    <w:p>
+      <w:pPr>
+        <w:spacing w:before="100" w:after="100"/>
+      </w:pPr>
+      <w:r>
+        <w:rPr>
+          <w:rFonts w:ascii="Arial" w:cs="Arial" w:eastAsia="Arial" w:hAnsi="Arial"/>
+          <w:b/>
+          <w:bCs/>
+          <w:sz w:val="22"/>
+          <w:szCs w:val="22"/>
+        </w:rPr>
+        <w:t xml:space="preserve">3.2 </w:t>
+      </w:r>
+      <w:r>
+        <w:rPr>
+          <w:rFonts w:ascii="Arial" w:cs="Arial" w:eastAsia="Arial" w:hAnsi="Arial"/>
+          <w:sz w:val="22"/>
+          <w:szCs w:val="22"/>
+        </w:rPr>
+        <w:t xml:space="preserve">Het uurtarief voor Werkzaamheden buiten scope bedraagt €125,00 exclusief BTW.</w:t>
+      </w:r>
+    </w:p>
+    <w:p>
+      <w:pPr>
+        <w:spacing w:before="100" w:after="100"/>
+      </w:pPr>
+      <w:r>
+        <w:rPr>
+          <w:rFonts w:ascii="Arial" w:cs="Arial" w:eastAsia="Arial" w:hAnsi="Arial"/>
+          <w:b/>
+          <w:bCs/>
+          <w:sz w:val="22"/>
+          <w:szCs w:val="22"/>
+        </w:rPr>
+        <w:t xml:space="preserve">3.3 </w:t>
+      </w:r>
+      <w:r>
+        <w:rPr>
+          <w:rFonts w:ascii="Arial" w:cs="Arial" w:eastAsia="Arial" w:hAnsi="Arial"/>
+          <w:sz w:val="22"/>
+          <w:szCs w:val="22"/>
+        </w:rPr>
+        <w:t xml:space="preserve">Opdrachtnemer factureert Werkzaamheden buiten scope maandelijks achteraf op basis van bestede uren.</w:t>
+      </w:r>
+    </w:p>
+    <w:p>
+      <w:pPr>
+        <w:spacing w:before="100" w:after="100"/>
+      </w:pPr>
+      <w:r>
+        <w:rPr>
+          <w:rFonts w:ascii="Arial" w:cs="Arial" w:eastAsia="Arial" w:hAnsi="Arial"/>
+          <w:b/>
+          <w:bCs/>
+          <w:sz w:val="22"/>
+          <w:szCs w:val="22"/>
+        </w:rPr>
+        <w:t xml:space="preserve">3.4 </w:t>
+      </w:r>
+      <w:r>
+        <w:rPr>
+          <w:rFonts w:ascii="Arial" w:cs="Arial" w:eastAsia="Arial" w:hAnsi="Arial"/>
+          <w:sz w:val="22"/>
+          <w:szCs w:val="22"/>
+        </w:rPr>
+        <w:t xml:space="preserve">Op Werkzaamheden buiten scope zijn de overige bepalingen van deze overeenkomst onverkort van toepassing, tenzij schriftelijk anders overeengekomen.</w:t>
+      </w:r>
+    </w:p>
+    <w:p>
+      <w:pPr>
+        <w:pStyle w:val="Heading1"/>
+        <w:spacing w:before="400" w:after="150"/>
+      </w:pPr>
+      <w:r>
+        <w:rPr>
+          <w:rFonts w:ascii="Arial" w:cs="Arial" w:eastAsia="Arial" w:hAnsi="Arial"/>
+          <w:b/>
+          <w:bCs/>
+          <w:sz w:val="24"/>
+          <w:szCs w:val="24"/>
+        </w:rPr>
+        <w:t xml:space="preserve">Artikel 4 — Hostingkosten</w:t>
+      </w:r>
+    </w:p>
+    <w:p>
+      <w:pPr>
+        <w:spacing w:before="200" w:after="100"/>
+      </w:pPr>
+      <w:r>
+        <w:rPr>
+          <w:rFonts w:ascii="Arial" w:cs="Arial" w:eastAsia="Arial" w:hAnsi="Arial"/>
+          <w:b/>
+          <w:bCs/>
+          <w:sz w:val="22"/>
+          <w:szCs w:val="22"/>
+        </w:rPr>
+        <w:t xml:space="preserve">4.1 Specificatie</w:t>
+      </w:r>
+    </w:p>
+    <w:p>
+      <w:pPr>
+        <w:spacing w:before="100" w:after="100"/>
+      </w:pPr>
+      <w:r>
+        <w:rPr>
+          <w:rFonts w:ascii="Arial" w:cs="Arial" w:eastAsia="Arial" w:hAnsi="Arial"/>
+          <w:sz w:val="22"/>
+          <w:szCs w:val="22"/>
+        </w:rPr>
+        <w:t xml:space="preserve">Het Platform draait op de volgende infrastructuur:</w:t>
       </w:r>
     </w:p>
     <w:p>
@@ -1556,775 +2557,6 @@
                 <w:sz w:val="20"/>
                 <w:szCs w:val="20"/>
               </w:rPr>
-              <w:t xml:space="preserve">Type</w:t>
-            </w:r>
-          </w:p>
-        </w:tc>
-        <w:tc>
-          <w:tcPr>
-            <w:tcW w:type="dxa" w:w="3000"/>
-            <w:tcBorders>
-              <w:top w:val="single" w:color="999999" w:sz="1"/>
-              <w:left w:val="single" w:color="999999" w:sz="1"/>
-              <w:bottom w:val="single" w:color="999999" w:sz="1"/>
-              <w:right w:val="single" w:color="999999" w:sz="1"/>
-            </w:tcBorders>
-            <w:shd w:fill="E8E8E8" w:val="clear"/>
-          </w:tcPr>
-          <w:p>
-            <w:pPr>
-              <w:spacing w:before="40" w:after="40"/>
-            </w:pPr>
-            <w:r>
-              <w:rPr>
-                <w:rFonts w:ascii="Arial" w:cs="Arial" w:eastAsia="Arial" w:hAnsi="Arial"/>
-                <w:b/>
-                <w:bCs/>
-                <w:sz w:val="20"/>
-                <w:szCs w:val="20"/>
-              </w:rPr>
-              <w:t xml:space="preserve">Reactietijd</w:t>
-            </w:r>
-          </w:p>
-        </w:tc>
-        <w:tc>
-          <w:tcPr>
-            <w:tcW w:type="dxa" w:w="2860"/>
-            <w:tcBorders>
-              <w:top w:val="single" w:color="999999" w:sz="1"/>
-              <w:left w:val="single" w:color="999999" w:sz="1"/>
-              <w:bottom w:val="single" w:color="999999" w:sz="1"/>
-              <w:right w:val="single" w:color="999999" w:sz="1"/>
-            </w:tcBorders>
-            <w:shd w:fill="E8E8E8" w:val="clear"/>
-          </w:tcPr>
-          <w:p>
-            <w:pPr>
-              <w:spacing w:before="40" w:after="40"/>
-            </w:pPr>
-            <w:r>
-              <w:rPr>
-                <w:rFonts w:ascii="Arial" w:cs="Arial" w:eastAsia="Arial" w:hAnsi="Arial"/>
-                <w:b/>
-                <w:bCs/>
-                <w:sz w:val="20"/>
-                <w:szCs w:val="20"/>
-              </w:rPr>
-              <w:t xml:space="preserve">Oplostijd</w:t>
-            </w:r>
-          </w:p>
-        </w:tc>
-      </w:tr>
-      <w:tr>
-        <w:tc>
-          <w:tcPr>
-            <w:tcW w:type="dxa" w:w="3500"/>
-            <w:tcBorders>
-              <w:top w:val="single" w:color="999999" w:sz="1"/>
-              <w:left w:val="single" w:color="999999" w:sz="1"/>
-              <w:bottom w:val="single" w:color="999999" w:sz="1"/>
-              <w:right w:val="single" w:color="999999" w:sz="1"/>
-            </w:tcBorders>
-          </w:tcPr>
-          <w:p>
-            <w:pPr>
-              <w:spacing w:before="40" w:after="40"/>
-            </w:pPr>
-            <w:r>
-              <w:rPr>
-                <w:rFonts w:ascii="Arial" w:cs="Arial" w:eastAsia="Arial" w:hAnsi="Arial"/>
-                <w:sz w:val="20"/>
-                <w:szCs w:val="20"/>
-              </w:rPr>
-              <w:t xml:space="preserve">Platform volledig onbereikbaar</w:t>
-            </w:r>
-          </w:p>
-        </w:tc>
-        <w:tc>
-          <w:tcPr>
-            <w:tcW w:type="dxa" w:w="3000"/>
-            <w:tcBorders>
-              <w:top w:val="single" w:color="999999" w:sz="1"/>
-              <w:left w:val="single" w:color="999999" w:sz="1"/>
-              <w:bottom w:val="single" w:color="999999" w:sz="1"/>
-              <w:right w:val="single" w:color="999999" w:sz="1"/>
-            </w:tcBorders>
-          </w:tcPr>
-          <w:p>
-            <w:pPr>
-              <w:spacing w:before="40" w:after="40"/>
-            </w:pPr>
-            <w:r>
-              <w:rPr>
-                <w:rFonts w:ascii="Arial" w:cs="Arial" w:eastAsia="Arial" w:hAnsi="Arial"/>
-                <w:sz w:val="20"/>
-                <w:szCs w:val="20"/>
-              </w:rPr>
-              <w:t xml:space="preserve">4 uur (binnen werktijden)</w:t>
-            </w:r>
-          </w:p>
-        </w:tc>
-        <w:tc>
-          <w:tcPr>
-            <w:tcW w:type="dxa" w:w="2860"/>
-            <w:tcBorders>
-              <w:top w:val="single" w:color="999999" w:sz="1"/>
-              <w:left w:val="single" w:color="999999" w:sz="1"/>
-              <w:bottom w:val="single" w:color="999999" w:sz="1"/>
-              <w:right w:val="single" w:color="999999" w:sz="1"/>
-            </w:tcBorders>
-          </w:tcPr>
-          <w:p>
-            <w:pPr>
-              <w:spacing w:before="40" w:after="40"/>
-            </w:pPr>
-            <w:r>
-              <w:rPr>
-                <w:rFonts w:ascii="Arial" w:cs="Arial" w:eastAsia="Arial" w:hAnsi="Arial"/>
-                <w:sz w:val="20"/>
-                <w:szCs w:val="20"/>
-              </w:rPr>
-              <w:t xml:space="preserve">Best effort</w:t>
-            </w:r>
-          </w:p>
-        </w:tc>
-      </w:tr>
-      <w:tr>
-        <w:tc>
-          <w:tcPr>
-            <w:tcW w:type="dxa" w:w="3500"/>
-            <w:tcBorders>
-              <w:top w:val="single" w:color="999999" w:sz="1"/>
-              <w:left w:val="single" w:color="999999" w:sz="1"/>
-              <w:bottom w:val="single" w:color="999999" w:sz="1"/>
-              <w:right w:val="single" w:color="999999" w:sz="1"/>
-            </w:tcBorders>
-          </w:tcPr>
-          <w:p>
-            <w:pPr>
-              <w:spacing w:before="40" w:after="40"/>
-            </w:pPr>
-            <w:r>
-              <w:rPr>
-                <w:rFonts w:ascii="Arial" w:cs="Arial" w:eastAsia="Arial" w:hAnsi="Arial"/>
-                <w:sz w:val="20"/>
-                <w:szCs w:val="20"/>
-              </w:rPr>
-              <w:t xml:space="preserve">Kritieke bug</w:t>
-            </w:r>
-          </w:p>
-        </w:tc>
-        <w:tc>
-          <w:tcPr>
-            <w:tcW w:type="dxa" w:w="3000"/>
-            <w:tcBorders>
-              <w:top w:val="single" w:color="999999" w:sz="1"/>
-              <w:left w:val="single" w:color="999999" w:sz="1"/>
-              <w:bottom w:val="single" w:color="999999" w:sz="1"/>
-              <w:right w:val="single" w:color="999999" w:sz="1"/>
-            </w:tcBorders>
-          </w:tcPr>
-          <w:p>
-            <w:pPr>
-              <w:spacing w:before="40" w:after="40"/>
-            </w:pPr>
-            <w:r>
-              <w:rPr>
-                <w:rFonts w:ascii="Arial" w:cs="Arial" w:eastAsia="Arial" w:hAnsi="Arial"/>
-                <w:sz w:val="20"/>
-                <w:szCs w:val="20"/>
-              </w:rPr>
-              <w:t xml:space="preserve">24 uur</w:t>
-            </w:r>
-          </w:p>
-        </w:tc>
-        <w:tc>
-          <w:tcPr>
-            <w:tcW w:type="dxa" w:w="2860"/>
-            <w:tcBorders>
-              <w:top w:val="single" w:color="999999" w:sz="1"/>
-              <w:left w:val="single" w:color="999999" w:sz="1"/>
-              <w:bottom w:val="single" w:color="999999" w:sz="1"/>
-              <w:right w:val="single" w:color="999999" w:sz="1"/>
-            </w:tcBorders>
-          </w:tcPr>
-          <w:p>
-            <w:pPr>
-              <w:spacing w:before="40" w:after="40"/>
-            </w:pPr>
-            <w:r>
-              <w:rPr>
-                <w:rFonts w:ascii="Arial" w:cs="Arial" w:eastAsia="Arial" w:hAnsi="Arial"/>
-                <w:sz w:val="20"/>
-                <w:szCs w:val="20"/>
-              </w:rPr>
-              <w:t xml:space="preserve">72 uur</w:t>
-            </w:r>
-          </w:p>
-        </w:tc>
-      </w:tr>
-      <w:tr>
-        <w:tc>
-          <w:tcPr>
-            <w:tcW w:type="dxa" w:w="3500"/>
-            <w:tcBorders>
-              <w:top w:val="single" w:color="999999" w:sz="1"/>
-              <w:left w:val="single" w:color="999999" w:sz="1"/>
-              <w:bottom w:val="single" w:color="999999" w:sz="1"/>
-              <w:right w:val="single" w:color="999999" w:sz="1"/>
-            </w:tcBorders>
-          </w:tcPr>
-          <w:p>
-            <w:pPr>
-              <w:spacing w:before="40" w:after="40"/>
-            </w:pPr>
-            <w:r>
-              <w:rPr>
-                <w:rFonts w:ascii="Arial" w:cs="Arial" w:eastAsia="Arial" w:hAnsi="Arial"/>
-                <w:sz w:val="20"/>
-                <w:szCs w:val="20"/>
-              </w:rPr>
-              <w:t xml:space="preserve">Security patch</w:t>
-            </w:r>
-          </w:p>
-        </w:tc>
-        <w:tc>
-          <w:tcPr>
-            <w:tcW w:type="dxa" w:w="3000"/>
-            <w:tcBorders>
-              <w:top w:val="single" w:color="999999" w:sz="1"/>
-              <w:left w:val="single" w:color="999999" w:sz="1"/>
-              <w:bottom w:val="single" w:color="999999" w:sz="1"/>
-              <w:right w:val="single" w:color="999999" w:sz="1"/>
-            </w:tcBorders>
-          </w:tcPr>
-          <w:p>
-            <w:pPr>
-              <w:spacing w:before="40" w:after="40"/>
-            </w:pPr>
-            <w:r>
-              <w:rPr>
-                <w:rFonts w:ascii="Arial" w:cs="Arial" w:eastAsia="Arial" w:hAnsi="Arial"/>
-                <w:sz w:val="20"/>
-                <w:szCs w:val="20"/>
-              </w:rPr>
-              <w:t xml:space="preserve">48 uur</w:t>
-            </w:r>
-          </w:p>
-        </w:tc>
-        <w:tc>
-          <w:tcPr>
-            <w:tcW w:type="dxa" w:w="2860"/>
-            <w:tcBorders>
-              <w:top w:val="single" w:color="999999" w:sz="1"/>
-              <w:left w:val="single" w:color="999999" w:sz="1"/>
-              <w:bottom w:val="single" w:color="999999" w:sz="1"/>
-              <w:right w:val="single" w:color="999999" w:sz="1"/>
-            </w:tcBorders>
-          </w:tcPr>
-          <w:p>
-            <w:pPr>
-              <w:spacing w:before="40" w:after="40"/>
-            </w:pPr>
-            <w:r>
-              <w:rPr>
-                <w:rFonts w:ascii="Arial" w:cs="Arial" w:eastAsia="Arial" w:hAnsi="Arial"/>
-                <w:sz w:val="20"/>
-                <w:szCs w:val="20"/>
-              </w:rPr>
-              <w:t xml:space="preserve">1 week</w:t>
-            </w:r>
-          </w:p>
-        </w:tc>
-      </w:tr>
-    </w:tbl>
-    <w:p>
-      <w:pPr>
-        <w:spacing w:before="100" w:after="100"/>
-      </w:pPr>
-      <w:r>
-        <w:rPr>
-          <w:rFonts w:ascii="Arial" w:cs="Arial" w:eastAsia="Arial" w:hAnsi="Arial"/>
-          <w:sz w:val="22"/>
-          <w:szCs w:val="22"/>
-        </w:rPr>
-        <w:t xml:space="preserve"/>
-      </w:r>
-    </w:p>
-    <w:p>
-      <w:pPr>
-        <w:spacing w:before="100" w:after="100"/>
-      </w:pPr>
-      <w:r>
-        <w:rPr>
-          <w:rFonts w:ascii="Arial" w:cs="Arial" w:eastAsia="Arial" w:hAnsi="Arial"/>
-          <w:sz w:val="22"/>
-          <w:szCs w:val="22"/>
-        </w:rPr>
-        <w:t xml:space="preserve">Werktijden: maandag t/m vrijdag, 9:00-17:00 CET. Meldingen buiten werktijden worden geacht te zijn ontvangen bij aanvang van de eerstvolgende werkdag.</w:t>
-      </w:r>
-    </w:p>
-    <w:p>
-      <w:pPr>
-        <w:spacing w:before="200" w:after="100"/>
-      </w:pPr>
-      <w:r>
-        <w:rPr>
-          <w:rFonts w:ascii="Arial" w:cs="Arial" w:eastAsia="Arial" w:hAnsi="Arial"/>
-          <w:b/>
-          <w:bCs/>
-          <w:sz w:val="22"/>
-          <w:szCs w:val="22"/>
-        </w:rPr>
-        <w:t xml:space="preserve">2.3 Maximale inzet</w:t>
-      </w:r>
-    </w:p>
-    <w:p>
-      <w:pPr>
-        <w:spacing w:before="100" w:after="100"/>
-      </w:pPr>
-      <w:r>
-        <w:rPr>
-          <w:rFonts w:ascii="Arial" w:cs="Arial" w:eastAsia="Arial" w:hAnsi="Arial"/>
-          <w:sz w:val="22"/>
-          <w:szCs w:val="22"/>
-        </w:rPr>
-        <w:t xml:space="preserve">De Diensten bedragen maximaal 1 uur per week gemiddeld over een kalendermaand. Opdrachtnemer is niet verplicht meer uren te besteden. Indien de Diensten structureel meer dan 1 uur per week vergen, is Artikel 5.3 van toepassing.</w:t>
-      </w:r>
-    </w:p>
-    <w:p>
-      <w:pPr>
-        <w:spacing w:before="200" w:after="100"/>
-      </w:pPr>
-      <w:r>
-        <w:rPr>
-          <w:rFonts w:ascii="Arial" w:cs="Arial" w:eastAsia="Arial" w:hAnsi="Arial"/>
-          <w:b/>
-          <w:bCs/>
-          <w:sz w:val="22"/>
-          <w:szCs w:val="22"/>
-        </w:rPr>
-        <w:t xml:space="preserve">2.4 Uitsluitingen</w:t>
-      </w:r>
-    </w:p>
-    <w:p>
-      <w:pPr>
-        <w:spacing w:before="100" w:after="100"/>
-      </w:pPr>
-      <w:r>
-        <w:rPr>
-          <w:rFonts w:ascii="Arial" w:cs="Arial" w:eastAsia="Arial" w:hAnsi="Arial"/>
-          <w:sz w:val="22"/>
-          <w:szCs w:val="22"/>
-        </w:rPr>
-        <w:t xml:space="preserve">De volgende werkzaamheden vallen uitdrukkelijk niet onder de Diensten:</w:t>
-      </w:r>
-    </w:p>
-    <w:p>
-      <w:pPr>
-        <w:spacing w:before="60" w:after="60"/>
-        <w:ind w:left="720"/>
-      </w:pPr>
-      <w:r>
-        <w:rPr>
-          <w:rFonts w:ascii="Arial" w:cs="Arial" w:eastAsia="Arial" w:hAnsi="Arial"/>
-          <w:sz w:val="22"/>
-          <w:szCs w:val="22"/>
-        </w:rPr>
-        <w:t xml:space="preserve">–  Eindgebruiker support, training of onboarding</w:t>
-      </w:r>
-    </w:p>
-    <w:p>
-      <w:pPr>
-        <w:spacing w:before="60" w:after="60"/>
-        <w:ind w:left="720"/>
-      </w:pPr>
-      <w:r>
-        <w:rPr>
-          <w:rFonts w:ascii="Arial" w:cs="Arial" w:eastAsia="Arial" w:hAnsi="Arial"/>
-          <w:sz w:val="22"/>
-          <w:szCs w:val="22"/>
-        </w:rPr>
-        <w:t xml:space="preserve">–  Nieuwe functionaliteit of feature requests</w:t>
-      </w:r>
-    </w:p>
-    <w:p>
-      <w:pPr>
-        <w:spacing w:before="60" w:after="60"/>
-        <w:ind w:left="720"/>
-      </w:pPr>
-      <w:r>
-        <w:rPr>
-          <w:rFonts w:ascii="Arial" w:cs="Arial" w:eastAsia="Arial" w:hAnsi="Arial"/>
-          <w:sz w:val="22"/>
-          <w:szCs w:val="22"/>
-        </w:rPr>
-        <w:t xml:space="preserve">–  Uitbreidingen van bestaande functionaliteit</w:t>
-      </w:r>
-    </w:p>
-    <w:p>
-      <w:pPr>
-        <w:spacing w:before="60" w:after="60"/>
-        <w:ind w:left="720"/>
-      </w:pPr>
-      <w:r>
-        <w:rPr>
-          <w:rFonts w:ascii="Arial" w:cs="Arial" w:eastAsia="Arial" w:hAnsi="Arial"/>
-          <w:sz w:val="22"/>
-          <w:szCs w:val="22"/>
-        </w:rPr>
-        <w:t xml:space="preserve">–  Integraties met externe systemen (inclusief maar niet beperkt tot SpiekR)</w:t>
-      </w:r>
-    </w:p>
-    <w:p>
-      <w:pPr>
-        <w:spacing w:before="60" w:after="60"/>
-        <w:ind w:left="720"/>
-      </w:pPr>
-      <w:r>
-        <w:rPr>
-          <w:rFonts w:ascii="Arial" w:cs="Arial" w:eastAsia="Arial" w:hAnsi="Arial"/>
-          <w:sz w:val="22"/>
-          <w:szCs w:val="22"/>
-        </w:rPr>
-        <w:t xml:space="preserve">–  Mobile applicaties (inclusief maar niet beperkt tot Dinckly iOS)</w:t>
-      </w:r>
-    </w:p>
-    <w:p>
-      <w:pPr>
-        <w:spacing w:before="60" w:after="60"/>
-        <w:ind w:left="720"/>
-      </w:pPr>
-      <w:r>
-        <w:rPr>
-          <w:rFonts w:ascii="Arial" w:cs="Arial" w:eastAsia="Arial" w:hAnsi="Arial"/>
-          <w:sz w:val="22"/>
-          <w:szCs w:val="22"/>
-        </w:rPr>
-        <w:t xml:space="preserve">–  UI/UX verbeteringen of design updates</w:t>
-      </w:r>
-    </w:p>
-    <w:p>
-      <w:pPr>
-        <w:spacing w:before="60" w:after="60"/>
-        <w:ind w:left="720"/>
-      </w:pPr>
-      <w:r>
-        <w:rPr>
-          <w:rFonts w:ascii="Arial" w:cs="Arial" w:eastAsia="Arial" w:hAnsi="Arial"/>
-          <w:sz w:val="22"/>
-          <w:szCs w:val="22"/>
-        </w:rPr>
-        <w:t xml:space="preserve">–  Performance optimalisatie (tenzij sprake van een Kritieke bug)</w:t>
-      </w:r>
-    </w:p>
-    <w:p>
-      <w:pPr>
-        <w:spacing w:before="60" w:after="60"/>
-        <w:ind w:left="720"/>
-      </w:pPr>
-      <w:r>
-        <w:rPr>
-          <w:rFonts w:ascii="Arial" w:cs="Arial" w:eastAsia="Arial" w:hAnsi="Arial"/>
-          <w:sz w:val="22"/>
-          <w:szCs w:val="22"/>
-        </w:rPr>
-        <w:t xml:space="preserve">–  Refactoring of architectuurverbeteringen</w:t>
-      </w:r>
-    </w:p>
-    <w:p>
-      <w:pPr>
-        <w:spacing w:before="60" w:after="60"/>
-        <w:ind w:left="720"/>
-      </w:pPr>
-      <w:r>
-        <w:rPr>
-          <w:rFonts w:ascii="Arial" w:cs="Arial" w:eastAsia="Arial" w:hAnsi="Arial"/>
-          <w:sz w:val="22"/>
-          <w:szCs w:val="22"/>
-        </w:rPr>
-        <w:t xml:space="preserve">–  Niet-kritieke bugs (cosmetische issues, minor usability problemen, edge cases)</w:t>
-      </w:r>
-    </w:p>
-    <w:p>
-      <w:pPr>
-        <w:spacing w:before="60" w:after="60"/>
-        <w:ind w:left="720"/>
-      </w:pPr>
-      <w:r>
-        <w:rPr>
-          <w:rFonts w:ascii="Arial" w:cs="Arial" w:eastAsia="Arial" w:hAnsi="Arial"/>
-          <w:sz w:val="22"/>
-          <w:szCs w:val="22"/>
-        </w:rPr>
-        <w:t xml:space="preserve">–  Documentatie updates</w:t>
-      </w:r>
-    </w:p>
-    <w:p>
-      <w:pPr>
-        <w:spacing w:before="60" w:after="60"/>
-        <w:ind w:left="720"/>
-      </w:pPr>
-      <w:r>
-        <w:rPr>
-          <w:rFonts w:ascii="Arial" w:cs="Arial" w:eastAsia="Arial" w:hAnsi="Arial"/>
-          <w:sz w:val="22"/>
-          <w:szCs w:val="22"/>
-        </w:rPr>
-        <w:t xml:space="preserve">–  Database optimalisatie (niet-kritiek)</w:t>
-      </w:r>
-    </w:p>
-    <w:p>
-      <w:pPr>
-        <w:spacing w:before="60" w:after="60"/>
-        <w:ind w:left="720"/>
-      </w:pPr>
-      <w:r>
-        <w:rPr>
-          <w:rFonts w:ascii="Arial" w:cs="Arial" w:eastAsia="Arial" w:hAnsi="Arial"/>
-          <w:sz w:val="22"/>
-          <w:szCs w:val="22"/>
-        </w:rPr>
-        <w:t xml:space="preserve">–  Caching implementaties</w:t>
-      </w:r>
-    </w:p>
-    <w:p>
-      <w:pPr>
-        <w:spacing w:before="100" w:after="100"/>
-      </w:pPr>
-      <w:r>
-        <w:rPr>
-          <w:rFonts w:ascii="Arial" w:cs="Arial" w:eastAsia="Arial" w:hAnsi="Arial"/>
-          <w:sz w:val="22"/>
-          <w:szCs w:val="22"/>
-        </w:rPr>
-        <w:t xml:space="preserve"/>
-      </w:r>
-    </w:p>
-    <w:p>
-      <w:pPr>
-        <w:spacing w:before="100" w:after="100"/>
-      </w:pPr>
-      <w:r>
-        <w:rPr>
-          <w:rFonts w:ascii="Arial" w:cs="Arial" w:eastAsia="Arial" w:hAnsi="Arial"/>
-          <w:i/>
-          <w:iCs/>
-          <w:sz w:val="22"/>
-          <w:szCs w:val="22"/>
-        </w:rPr>
-        <w:t xml:space="preserve">Bij twijfel over de classificatie van een verzoek beslist Opdrachtnemer.</w:t>
-      </w:r>
-    </w:p>
-    <w:p>
-      <w:pPr>
-        <w:pStyle w:val="Heading1"/>
-        <w:spacing w:before="400" w:after="150"/>
-      </w:pPr>
-      <w:r>
-        <w:rPr>
-          <w:rFonts w:ascii="Arial" w:cs="Arial" w:eastAsia="Arial" w:hAnsi="Arial"/>
-          <w:b/>
-          <w:bCs/>
-          <w:sz w:val="24"/>
-          <w:szCs w:val="24"/>
-        </w:rPr>
-        <w:t xml:space="preserve">Artikel 3 — Werkzaamheden buiten scope</w:t>
-      </w:r>
-    </w:p>
-    <w:p>
-      <w:pPr>
-        <w:spacing w:before="100" w:after="100"/>
-      </w:pPr>
-      <w:r>
-        <w:rPr>
-          <w:rFonts w:ascii="Arial" w:cs="Arial" w:eastAsia="Arial" w:hAnsi="Arial"/>
-          <w:b/>
-          <w:bCs/>
-          <w:sz w:val="22"/>
-          <w:szCs w:val="22"/>
-        </w:rPr>
-        <w:t xml:space="preserve">3.1 </w:t>
-      </w:r>
-      <w:r>
-        <w:rPr>
-          <w:rFonts w:ascii="Arial" w:cs="Arial" w:eastAsia="Arial" w:hAnsi="Arial"/>
-          <w:sz w:val="22"/>
-          <w:szCs w:val="22"/>
-        </w:rPr>
-        <w:t xml:space="preserve">Werkzaamheden buiten scope worden uitsluitend verricht na voorafgaande schriftelijke offerte door Opdrachtnemer en schriftelijke goedkeuring door Opdrachtgever.</w:t>
-      </w:r>
-    </w:p>
-    <w:p>
-      <w:pPr>
-        <w:spacing w:before="100" w:after="100"/>
-      </w:pPr>
-      <w:r>
-        <w:rPr>
-          <w:rFonts w:ascii="Arial" w:cs="Arial" w:eastAsia="Arial" w:hAnsi="Arial"/>
-          <w:b/>
-          <w:bCs/>
-          <w:sz w:val="22"/>
-          <w:szCs w:val="22"/>
-        </w:rPr>
-        <w:t xml:space="preserve">3.2 </w:t>
-      </w:r>
-      <w:r>
-        <w:rPr>
-          <w:rFonts w:ascii="Arial" w:cs="Arial" w:eastAsia="Arial" w:hAnsi="Arial"/>
-          <w:sz w:val="22"/>
-          <w:szCs w:val="22"/>
-        </w:rPr>
-        <w:t xml:space="preserve">Het uurtarief voor Werkzaamheden buiten scope bedraagt €125,00 exclusief BTW.</w:t>
-      </w:r>
-    </w:p>
-    <w:p>
-      <w:pPr>
-        <w:spacing w:before="100" w:after="100"/>
-      </w:pPr>
-      <w:r>
-        <w:rPr>
-          <w:rFonts w:ascii="Arial" w:cs="Arial" w:eastAsia="Arial" w:hAnsi="Arial"/>
-          <w:b/>
-          <w:bCs/>
-          <w:sz w:val="22"/>
-          <w:szCs w:val="22"/>
-        </w:rPr>
-        <w:t xml:space="preserve">3.3 </w:t>
-      </w:r>
-      <w:r>
-        <w:rPr>
-          <w:rFonts w:ascii="Arial" w:cs="Arial" w:eastAsia="Arial" w:hAnsi="Arial"/>
-          <w:sz w:val="22"/>
-          <w:szCs w:val="22"/>
-        </w:rPr>
-        <w:t xml:space="preserve">Opdrachtnemer factureert Werkzaamheden buiten scope maandelijks achteraf op basis van bestede uren.</w:t>
-      </w:r>
-    </w:p>
-    <w:p>
-      <w:pPr>
-        <w:spacing w:before="100" w:after="100"/>
-      </w:pPr>
-      <w:r>
-        <w:rPr>
-          <w:rFonts w:ascii="Arial" w:cs="Arial" w:eastAsia="Arial" w:hAnsi="Arial"/>
-          <w:b/>
-          <w:bCs/>
-          <w:sz w:val="22"/>
-          <w:szCs w:val="22"/>
-        </w:rPr>
-        <w:t xml:space="preserve">3.4 </w:t>
-      </w:r>
-      <w:r>
-        <w:rPr>
-          <w:rFonts w:ascii="Arial" w:cs="Arial" w:eastAsia="Arial" w:hAnsi="Arial"/>
-          <w:sz w:val="22"/>
-          <w:szCs w:val="22"/>
-        </w:rPr>
-        <w:t xml:space="preserve">Op Werkzaamheden buiten scope zijn de overige bepalingen van deze overeenkomst onverkort van toepassing, tenzij schriftelijk anders overeengekomen.</w:t>
-      </w:r>
-    </w:p>
-    <w:p>
-      <w:pPr>
-        <w:pStyle w:val="Heading1"/>
-        <w:spacing w:before="400" w:after="150"/>
-      </w:pPr>
-      <w:r>
-        <w:rPr>
-          <w:rFonts w:ascii="Arial" w:cs="Arial" w:eastAsia="Arial" w:hAnsi="Arial"/>
-          <w:b/>
-          <w:bCs/>
-          <w:sz w:val="24"/>
-          <w:szCs w:val="24"/>
-        </w:rPr>
-        <w:t xml:space="preserve">Artikel 4 — Hostingkosten</w:t>
-      </w:r>
-    </w:p>
-    <w:p>
-      <w:pPr>
-        <w:spacing w:before="200" w:after="100"/>
-      </w:pPr>
-      <w:r>
-        <w:rPr>
-          <w:rFonts w:ascii="Arial" w:cs="Arial" w:eastAsia="Arial" w:hAnsi="Arial"/>
-          <w:b/>
-          <w:bCs/>
-          <w:sz w:val="22"/>
-          <w:szCs w:val="22"/>
-        </w:rPr>
-        <w:t xml:space="preserve">4.1 Specificatie</w:t>
-      </w:r>
-    </w:p>
-    <w:p>
-      <w:pPr>
-        <w:spacing w:before="100" w:after="100"/>
-      </w:pPr>
-      <w:r>
-        <w:rPr>
-          <w:rFonts w:ascii="Arial" w:cs="Arial" w:eastAsia="Arial" w:hAnsi="Arial"/>
-          <w:sz w:val="22"/>
-          <w:szCs w:val="22"/>
-        </w:rPr>
-        <w:t xml:space="preserve">Het Platform draait op de volgende infrastructuur:</w:t>
-      </w:r>
-    </w:p>
-    <w:p>
-      <w:pPr>
-        <w:spacing w:before="100" w:after="100"/>
-      </w:pPr>
-      <w:r>
-        <w:rPr>
-          <w:rFonts w:ascii="Arial" w:cs="Arial" w:eastAsia="Arial" w:hAnsi="Arial"/>
-          <w:sz w:val="22"/>
-          <w:szCs w:val="22"/>
-        </w:rPr>
-        <w:t xml:space="preserve"/>
-      </w:r>
-    </w:p>
-    <w:tbl>
-      <w:tblPr>
-        <w:tblW w:type="auto" w:w="100"/>
-        <w:tblBorders>
-          <w:top w:val="single" w:color="auto" w:sz="4"/>
-          <w:left w:val="single" w:color="auto" w:sz="4"/>
-          <w:bottom w:val="single" w:color="auto" w:sz="4"/>
-          <w:right w:val="single" w:color="auto" w:sz="4"/>
-          <w:insideH w:val="single" w:color="auto" w:sz="4"/>
-          <w:insideV w:val="single" w:color="auto" w:sz="4"/>
-        </w:tblBorders>
-      </w:tblPr>
-      <w:tblGrid>
-        <w:gridCol w:w="3500"/>
-        <w:gridCol w:w="3000"/>
-        <w:gridCol w:w="2860"/>
-      </w:tblGrid>
-      <w:tr>
-        <w:trPr>
-          <w:tblHeader/>
-        </w:trPr>
-        <w:tc>
-          <w:tcPr>
-            <w:tcW w:type="dxa" w:w="3500"/>
-            <w:tcBorders>
-              <w:top w:val="single" w:color="999999" w:sz="1"/>
-              <w:left w:val="single" w:color="999999" w:sz="1"/>
-              <w:bottom w:val="single" w:color="999999" w:sz="1"/>
-              <w:right w:val="single" w:color="999999" w:sz="1"/>
-            </w:tcBorders>
-            <w:shd w:fill="E8E8E8" w:val="clear"/>
-          </w:tcPr>
-          <w:p>
-            <w:pPr>
-              <w:spacing w:before="40" w:after="40"/>
-            </w:pPr>
-            <w:r>
-              <w:rPr>
-                <w:rFonts w:ascii="Arial" w:cs="Arial" w:eastAsia="Arial" w:hAnsi="Arial"/>
-                <w:b/>
-                <w:bCs/>
-                <w:sz w:val="20"/>
-                <w:szCs w:val="20"/>
-              </w:rPr>
               <w:t xml:space="preserve">Component</w:t>
             </w:r>
           </w:p>
@@ -3672,7 +3904,7 @@
           <w:sz w:val="22"/>
           <w:szCs w:val="22"/>
         </w:rPr>
-        <w:t xml:space="preserve">Bij het uitblijven van een reactie binnen de in Artikel 2.2 genoemde reactietijden, stuurt Opdrachtgever een e-mail met als onderwerp: "URGENT: [omschrijving probleem]". Opdrachtnemer reageert op een URGENT-melding binnen 2 uur tijdens werktijden.</w:t>
+        <w:t xml:space="preserve">Bij P1- en P2-incidenten stuurt Opdrachtgever een e-mail met als onderwerp: "URGENT: [omschrijving probleem]". Bij het uitblijven van een reactie binnen de in Artikel 2.2 genoemde reactietijden kan Opdrachtgever telefonisch contact opnemen.</w:t>
       </w:r>
     </w:p>
     <w:p>

</xml_diff>

<commit_message>
Add letterhead: logo header + business details footer on every page
</commit_message>
<xml_diff>
--- a/artifacts/KTLO_Overeenkomst_Dienstverlening.docx
+++ b/artifacts/KTLO_Overeenkomst_Dienstverlening.docx
@@ -4622,8 +4622,10 @@
       </w:tr>
     </w:tbl>
     <w:sectPr>
+      <w:headerReference w:type="default" r:id="rId6"/>
+      <w:footerReference w:type="default" r:id="rId7"/>
       <w:pgSz w:w="11906" w:h="16838" w:orient="portrait"/>
-      <w:pgMar w:top="1440" w:right="1440" w:bottom="1440" w:left="1440" w:header="708" w:footer="708" w:gutter="0"/>
+      <w:pgMar w:top="2160" w:right="1440" w:bottom="1440" w:left="1440" w:header="708" w:footer="708" w:gutter="0"/>
       <w:pgNumType/>
       <w:docGrid w:linePitch="360"/>
     </w:sectPr>
@@ -4635,6 +4637,40 @@
 <w:comments xmlns:cx="http://schemas.microsoft.com/office/drawing/2014/chartex" xmlns:cx1="http://schemas.microsoft.com/office/drawing/2015/9/8/chartex" xmlns:cx2="http://schemas.microsoft.com/office/drawing/2015/10/21/chartex" xmlns:cx3="http://schemas.microsoft.com/office/drawing/2016/5/9/chartex" xmlns:cx4="http://schemas.microsoft.com/office/drawing/2016/5/10/chartex" xmlns:cx5="http://schemas.microsoft.com/office/drawing/2016/5/11/chartex" xmlns:cx6="http://schemas.microsoft.com/office/drawing/2016/5/12/chartex" xmlns:cx7="http://schemas.microsoft.com/office/drawing/2016/5/13/chartex" xmlns:cx8="http://schemas.microsoft.com/office/drawing/2016/5/14/chartex" xmlns:mc="http://schemas.openxmlformats.org/markup-compatibility/2006" xmlns:aink="http://schemas.microsoft.com/office/drawing/2016/ink" xmlns:am3d="http://schemas.microsoft.com/office/drawing/2017/model3d" xmlns:o="urn:schemas-microsoft-com:office:office" xmlns:r="http://schemas.openxmlformats.org/officeDocument/2006/relationships" xmlns:m="http://schemas.openxmlformats.org/officeDocument/2006/math" xmlns:v="urn:schemas-microsoft-com:vml" xmlns:wp14="http://schemas.microsoft.com/office/word/2010/wordprocessingDrawing" xmlns:wp="http://schemas.openxmlformats.org/drawingml/2006/wordprocessingDrawing" xmlns:w10="urn:schemas-microsoft-com:office:word" xmlns:w="http://schemas.openxmlformats.org/wordprocessingml/2006/main" xmlns:w14="http://schemas.microsoft.com/office/word/2010/wordml" xmlns:w15="http://schemas.microsoft.com/office/word/2012/wordml" xmlns:w16cex="http://schemas.microsoft.com/office/word/2018/wordml/cex" xmlns:w16cid="http://schemas.microsoft.com/office/word/2016/wordml/cid" xmlns:w16="http://schemas.microsoft.com/office/word/2018/wordml" xmlns:w16sdtdh="http://schemas.microsoft.com/office/word/2020/wordml/sdtdatahash" xmlns:w16se="http://schemas.microsoft.com/office/word/2015/wordml/symex" xmlns:wpg="http://schemas.microsoft.com/office/word/2010/wordprocessingGroup" xmlns:wpi="http://schemas.microsoft.com/office/word/2010/wordprocessingInk" xmlns:wne="http://schemas.microsoft.com/office/word/2006/wordml" xmlns:wps="http://schemas.microsoft.com/office/word/2010/wordprocessingShape"/>
 </file>
 
+<file path=word/footer1.xml><?xml version="1.0" encoding="utf-8"?>
+<w:ftr xmlns:wpc="http://schemas.microsoft.com/office/word/2010/wordprocessingCanvas" xmlns:mc="http://schemas.openxmlformats.org/markup-compatibility/2006" xmlns:o="urn:schemas-microsoft-com:office:office" xmlns:r="http://schemas.openxmlformats.org/officeDocument/2006/relationships" xmlns:m="http://schemas.openxmlformats.org/officeDocument/2006/math" xmlns:v="urn:schemas-microsoft-com:vml" xmlns:wp14="http://schemas.microsoft.com/office/word/2010/wordprocessingDrawing" xmlns:wp="http://schemas.openxmlformats.org/drawingml/2006/wordprocessingDrawing" xmlns:w10="urn:schemas-microsoft-com:office:word" xmlns:w="http://schemas.openxmlformats.org/wordprocessingml/2006/main" xmlns:w14="http://schemas.microsoft.com/office/word/2010/wordml" xmlns:w15="http://schemas.microsoft.com/office/word/2012/wordml" xmlns:wpg="http://schemas.microsoft.com/office/word/2010/wordprocessingGroup" xmlns:wpi="http://schemas.microsoft.com/office/word/2010/wordprocessingInk" xmlns:wne="http://schemas.microsoft.com/office/word/2006/wordml" xmlns:wps="http://schemas.microsoft.com/office/word/2010/wordprocessingShape">
+  <w:p>
+    <w:pPr>
+      <w:pBdr>
+        <w:top w:val="single" w:color="CCCCCC" w:sz="1" w:space="4"/>
+      </w:pBdr>
+      <w:spacing w:before="100"/>
+      <w:jc w:val="center"/>
+    </w:pPr>
+    <w:r>
+      <w:rPr>
+        <w:rFonts w:ascii="Arial" w:cs="Arial" w:eastAsia="Arial" w:hAnsi="Arial"/>
+        <w:b/>
+        <w:bCs/>
+        <w:color w:val="555555"/>
+        <w:sz w:val="16"/>
+        <w:szCs w:val="16"/>
+      </w:rPr>
+      <w:t xml:space="preserve">Peter Berkenbosch Consultancy B.V.</w:t>
+    </w:r>
+    <w:r>
+      <w:rPr>
+        <w:rFonts w:ascii="Arial" w:cs="Arial" w:eastAsia="Arial" w:hAnsi="Arial"/>
+        <w:color w:val="555555"/>
+        <w:sz w:val="16"/>
+        <w:szCs w:val="16"/>
+      </w:rPr>
+      <w:t xml:space="preserve">  |  KvK 75867435  |  Martenskamp 14, 8431 LP Oosterwolde  |  info@peterberkenbosch.nl</w:t>
+    </w:r>
+  </w:p>
+</w:ftr>
+</file>
+
 <file path=word/footnotes.xml><?xml version="1.0" encoding="utf-8"?>
 <w:footnotes xmlns:wpc="http://schemas.microsoft.com/office/word/2010/wordprocessingCanvas" xmlns:mc="http://schemas.openxmlformats.org/markup-compatibility/2006" xmlns:o="urn:schemas-microsoft-com:office:office" xmlns:r="http://schemas.openxmlformats.org/officeDocument/2006/relationships" xmlns:m="http://schemas.openxmlformats.org/officeDocument/2006/math" xmlns:v="urn:schemas-microsoft-com:vml" xmlns:wp14="http://schemas.microsoft.com/office/word/2010/wordprocessingDrawing" xmlns:wp="http://schemas.openxmlformats.org/drawingml/2006/wordprocessingDrawing" xmlns:w10="urn:schemas-microsoft-com:office:word" xmlns:w="http://schemas.openxmlformats.org/wordprocessingml/2006/main" xmlns:w14="http://schemas.microsoft.com/office/word/2010/wordml" xmlns:w15="http://schemas.microsoft.com/office/word/2012/wordml" xmlns:wpg="http://schemas.microsoft.com/office/word/2010/wordprocessingGroup" xmlns:wpi="http://schemas.microsoft.com/office/word/2010/wordprocessingInk" xmlns:wne="http://schemas.microsoft.com/office/word/2006/wordml" xmlns:wps="http://schemas.microsoft.com/office/word/2010/wordprocessingShape" mc:Ignorable="w14 w15 wp14">
   <w:footnote w:type="separator" w:id="-1">
@@ -4670,6 +4706,56 @@
     </w:p>
   </w:footnote>
 </w:footnotes>
+</file>
+
+<file path=word/header1.xml><?xml version="1.0" encoding="utf-8"?>
+<w:hdr xmlns:wpc="http://schemas.microsoft.com/office/word/2010/wordprocessingCanvas" xmlns:mc="http://schemas.openxmlformats.org/markup-compatibility/2006" xmlns:o="urn:schemas-microsoft-com:office:office" xmlns:r="http://schemas.openxmlformats.org/officeDocument/2006/relationships" xmlns:m="http://schemas.openxmlformats.org/officeDocument/2006/math" xmlns:v="urn:schemas-microsoft-com:vml" xmlns:wp14="http://schemas.microsoft.com/office/word/2010/wordprocessingDrawing" xmlns:wp="http://schemas.openxmlformats.org/drawingml/2006/wordprocessingDrawing" xmlns:w10="urn:schemas-microsoft-com:office:word" xmlns:w="http://schemas.openxmlformats.org/wordprocessingml/2006/main" xmlns:w14="http://schemas.microsoft.com/office/word/2010/wordml" xmlns:w15="http://schemas.microsoft.com/office/word/2012/wordml" xmlns:wpg="http://schemas.microsoft.com/office/word/2010/wordprocessingGroup" xmlns:wpi="http://schemas.microsoft.com/office/word/2010/wordprocessingInk" xmlns:wne="http://schemas.microsoft.com/office/word/2006/wordml" xmlns:wps="http://schemas.microsoft.com/office/word/2010/wordprocessingShape" xmlns:cx="http://schemas.microsoft.com/office/drawing/2014/chartex" xmlns:cx1="http://schemas.microsoft.com/office/drawing/2015/9/8/chartex" xmlns:cx2="http://schemas.microsoft.com/office/drawing/2015/10/21/chartex" xmlns:cx3="http://schemas.microsoft.com/office/drawing/2016/5/9/chartex" xmlns:cx4="http://schemas.microsoft.com/office/drawing/2016/5/10/chartex" xmlns:cx5="http://schemas.microsoft.com/office/drawing/2016/5/11/chartex" xmlns:cx6="http://schemas.microsoft.com/office/drawing/2016/5/12/chartex" xmlns:cx7="http://schemas.microsoft.com/office/drawing/2016/5/13/chartex" xmlns:cx8="http://schemas.microsoft.com/office/drawing/2016/5/14/chartex" xmlns:w16cid="http://schemas.microsoft.com/office/word/2016/wordml/cid" xmlns:w16se="http://schemas.microsoft.com/office/word/2015/wordml/symex">
+  <w:p>
+    <w:pPr>
+      <w:spacing w:after="100"/>
+    </w:pPr>
+    <w:r>
+      <w:drawing>
+        <wp:inline distT="0" distB="0" distL="0" distR="0">
+          <wp:extent cx="1714500" cy="1333500"/>
+          <wp:effectExtent t="0" r="0" b="0" l="0"/>
+          <wp:docPr id="1" descr="Company logo" title="Peter Berkenbosch Consultancy"/>
+          <wp:cNvGraphicFramePr>
+            <a:graphicFrameLocks xmlns:a="http://schemas.openxmlformats.org/drawingml/2006/main" noChangeAspect="1"/>
+          </wp:cNvGraphicFramePr>
+          <a:graphic xmlns:a="http://schemas.openxmlformats.org/drawingml/2006/main">
+            <a:graphicData uri="http://schemas.openxmlformats.org/drawingml/2006/picture">
+              <pic:pic xmlns:pic="http://schemas.openxmlformats.org/drawingml/2006/picture">
+                <pic:nvPicPr>
+                  <pic:cNvPr id="0" name="" descr=""/>
+                  <pic:cNvPicPr>
+                    <a:picLocks noChangeAspect="1" noChangeArrowheads="1"/>
+                  </pic:cNvPicPr>
+                </pic:nvPicPr>
+                <pic:blipFill>
+                  <a:blip r:embed="rId0" cstate="none"/>
+                  <a:srcRect/>
+                  <a:stretch>
+                    <a:fillRect/>
+                  </a:stretch>
+                </pic:blipFill>
+                <pic:spPr bwMode="auto">
+                  <a:xfrm>
+                    <a:off x="0" y="0"/>
+                    <a:ext cx="1714500" cy="1333500"/>
+                  </a:xfrm>
+                  <a:prstGeom prst="rect">
+                    <a:avLst/>
+                  </a:prstGeom>
+                </pic:spPr>
+              </pic:pic>
+            </a:graphicData>
+          </a:graphic>
+        </wp:inline>
+      </w:drawing>
+    </w:r>
+  </w:p>
+</w:hdr>
 </file>
 
 <file path=word/numbering.xml><?xml version="1.0" encoding="utf-8"?>

</xml_diff>

<commit_message>
Footer: smaller font + wider indent to fit on single line
</commit_message>
<xml_diff>
--- a/artifacts/KTLO_Overeenkomst_Dienstverlening.docx
+++ b/artifacts/KTLO_Overeenkomst_Dienstverlening.docx
@@ -4645,6 +4645,7 @@
         <w:top w:val="single" w:color="CCCCCC" w:sz="1" w:space="4"/>
       </w:pBdr>
       <w:spacing w:before="100"/>
+      <w:ind w:left="-720" w:right="-720"/>
       <w:jc w:val="center"/>
     </w:pPr>
     <w:r>
@@ -4653,8 +4654,8 @@
         <w:b/>
         <w:bCs/>
         <w:color w:val="555555"/>
-        <w:sz w:val="16"/>
-        <w:szCs w:val="16"/>
+        <w:sz w:val="14"/>
+        <w:szCs w:val="14"/>
       </w:rPr>
       <w:t xml:space="preserve">Peter Berkenbosch Consultancy B.V.</w:t>
     </w:r>
@@ -4662,10 +4663,10 @@
       <w:rPr>
         <w:rFonts w:ascii="Arial" w:cs="Arial" w:eastAsia="Arial" w:hAnsi="Arial"/>
         <w:color w:val="555555"/>
-        <w:sz w:val="16"/>
-        <w:szCs w:val="16"/>
+        <w:sz w:val="14"/>
+        <w:szCs w:val="14"/>
       </w:rPr>
-      <w:t xml:space="preserve">  |  KvK 75867435  |  Martenskamp 14, 8431 LP Oosterwolde  |  info@peterberkenbosch.nl</w:t>
+      <w:t xml:space="preserve"> | KvK 75867435 | Martenskamp 14, 8431 LP Oosterwolde | info@peterberkenbosch.nl</w:t>
     </w:r>
   </w:p>
 </w:ftr>

</xml_diff>

<commit_message>
Replace header with styled cover page: centered logo, title, parties
</commit_message>
<xml_diff>
--- a/artifacts/KTLO_Overeenkomst_Dienstverlening.docx
+++ b/artifacts/KTLO_Overeenkomst_Dienstverlening.docx
@@ -4,42 +4,173 @@
   <w:body>
     <w:p>
       <w:pPr>
-        <w:spacing w:before="200" w:after="100"/>
+        <w:spacing w:before="2400" w:after="100"/>
+      </w:pPr>
+      <w:r>
+        <w:rPr>
+          <w:rFonts w:ascii="Arial" w:cs="Arial" w:eastAsia="Arial" w:hAnsi="Arial"/>
+          <w:sz w:val="22"/>
+          <w:szCs w:val="22"/>
+        </w:rPr>
+        <w:t xml:space="preserve"/>
+      </w:r>
+    </w:p>
+    <w:p>
+      <w:pPr>
+        <w:spacing w:before="2400" w:after="100"/>
+      </w:pPr>
+      <w:r>
+        <w:rPr>
+          <w:rFonts w:ascii="Arial" w:cs="Arial" w:eastAsia="Arial" w:hAnsi="Arial"/>
+          <w:sz w:val="22"/>
+          <w:szCs w:val="22"/>
+        </w:rPr>
+        <w:t xml:space="preserve"/>
+      </w:r>
+    </w:p>
+    <w:p>
+      <w:pPr>
+        <w:spacing w:before="0" w:after="600"/>
         <w:jc w:val="center"/>
       </w:pPr>
       <w:r>
-        <w:rPr>
-          <w:rFonts w:ascii="Arial" w:cs="Arial" w:eastAsia="Arial" w:hAnsi="Arial"/>
-          <w:b/>
-          <w:bCs/>
-          <w:sz w:val="28"/>
-          <w:szCs w:val="28"/>
+        <w:drawing>
+          <wp:inline distT="0" distB="0" distL="0" distR="0">
+            <wp:extent cx="2857500" cy="2219325"/>
+            <wp:effectExtent t="0" r="0" b="0" l="0"/>
+            <wp:docPr id="1" descr="Company logo" title="Peter Berkenbosch Consultancy"/>
+            <wp:cNvGraphicFramePr>
+              <a:graphicFrameLocks xmlns:a="http://schemas.openxmlformats.org/drawingml/2006/main" noChangeAspect="1"/>
+            </wp:cNvGraphicFramePr>
+            <a:graphic xmlns:a="http://schemas.openxmlformats.org/drawingml/2006/main">
+              <a:graphicData uri="http://schemas.openxmlformats.org/drawingml/2006/picture">
+                <pic:pic xmlns:pic="http://schemas.openxmlformats.org/drawingml/2006/picture">
+                  <pic:nvPicPr>
+                    <pic:cNvPr id="0" name="" descr=""/>
+                    <pic:cNvPicPr>
+                      <a:picLocks noChangeAspect="1" noChangeArrowheads="1"/>
+                    </pic:cNvPicPr>
+                  </pic:nvPicPr>
+                  <pic:blipFill>
+                    <a:blip r:embed="rId7" cstate="none"/>
+                    <a:srcRect/>
+                    <a:stretch>
+                      <a:fillRect/>
+                    </a:stretch>
+                  </pic:blipFill>
+                  <pic:spPr bwMode="auto">
+                    <a:xfrm>
+                      <a:off x="0" y="0"/>
+                      <a:ext cx="2857500" cy="2219325"/>
+                    </a:xfrm>
+                    <a:prstGeom prst="rect">
+                      <a:avLst/>
+                    </a:prstGeom>
+                  </pic:spPr>
+                </pic:pic>
+              </a:graphicData>
+            </a:graphic>
+          </wp:inline>
+        </w:drawing>
+      </w:r>
+    </w:p>
+    <w:p>
+      <w:pPr>
+        <w:spacing w:before="400" w:after="100"/>
+        <w:jc w:val="center"/>
+      </w:pPr>
+      <w:r>
+        <w:rPr>
+          <w:rFonts w:ascii="Arial" w:cs="Arial" w:eastAsia="Arial" w:hAnsi="Arial"/>
+          <w:b/>
+          <w:bCs/>
+          <w:sz w:val="32"/>
+          <w:szCs w:val="32"/>
         </w:rPr>
         <w:t xml:space="preserve">OVEREENKOMST VAN DIENSTVERLENING</w:t>
       </w:r>
     </w:p>
     <w:p>
       <w:pPr>
-        <w:spacing w:before="0" w:after="300"/>
+        <w:spacing w:before="0" w:after="600"/>
         <w:jc w:val="center"/>
       </w:pPr>
       <w:r>
         <w:rPr>
           <w:rFonts w:ascii="Arial" w:cs="Arial" w:eastAsia="Arial" w:hAnsi="Arial"/>
-          <w:b/>
-          <w:bCs/>
-          <w:sz w:val="24"/>
-          <w:szCs w:val="24"/>
+          <w:color w:val="444444"/>
+          <w:sz w:val="26"/>
+          <w:szCs w:val="26"/>
         </w:rPr>
         <w:t xml:space="preserve">KTLO Platform app.dinck.nl</w:t>
       </w:r>
     </w:p>
     <w:p>
       <w:pPr>
-        <w:pBdr>
-          <w:bottom w:val="single" w:color="CCCCCC" w:sz="1" w:space="1"/>
-        </w:pBdr>
-        <w:spacing w:before="100" w:after="200"/>
+        <w:spacing w:before="400" w:after="100"/>
+        <w:jc w:val="center"/>
+      </w:pPr>
+      <w:r>
+        <w:rPr>
+          <w:rFonts w:ascii="Arial" w:cs="Arial" w:eastAsia="Arial" w:hAnsi="Arial"/>
+          <w:color w:val="666666"/>
+          <w:sz w:val="22"/>
+          <w:szCs w:val="22"/>
+        </w:rPr>
+        <w:t xml:space="preserve">1 maart 2026</w:t>
+      </w:r>
+    </w:p>
+    <w:p>
+      <w:pPr>
+        <w:spacing w:before="800" w:after="60"/>
+        <w:jc w:val="center"/>
+      </w:pPr>
+      <w:r>
+        <w:rPr>
+          <w:rFonts w:ascii="Arial" w:cs="Arial" w:eastAsia="Arial" w:hAnsi="Arial"/>
+          <w:sz w:val="22"/>
+          <w:szCs w:val="22"/>
+        </w:rPr>
+        <w:t xml:space="preserve">Peter Berkenbosch Consultancy B.V.</w:t>
+      </w:r>
+    </w:p>
+    <w:p>
+      <w:pPr>
+        <w:spacing w:before="60" w:after="60"/>
+        <w:jc w:val="center"/>
+      </w:pPr>
+      <w:r>
+        <w:rPr>
+          <w:rFonts w:ascii="Arial" w:cs="Arial" w:eastAsia="Arial" w:hAnsi="Arial"/>
+          <w:color w:val="888888"/>
+          <w:sz w:val="20"/>
+          <w:szCs w:val="20"/>
+        </w:rPr>
+        <w:t xml:space="preserve">en</w:t>
+      </w:r>
+    </w:p>
+    <w:p>
+      <w:pPr>
+        <w:spacing w:before="60" w:after="100"/>
+        <w:jc w:val="center"/>
+      </w:pPr>
+      <w:r>
+        <w:rPr>
+          <w:rFonts w:ascii="Arial" w:cs="Arial" w:eastAsia="Arial" w:hAnsi="Arial"/>
+          <w:sz w:val="22"/>
+          <w:szCs w:val="22"/>
+        </w:rPr>
+        <w:t xml:space="preserve">Dinck B.V.</w:t>
+      </w:r>
+    </w:p>
+    <w:p>
+      <w:pPr>
+        <w:sectPr>
+          <w:pgSz w:w="11906" w:h="16838" w:orient="portrait"/>
+          <w:pgMar w:top="1440" w:right="1440" w:bottom="1440" w:left="1440" w:header="708" w:footer="708" w:gutter="0"/>
+          <w:pgNumType/>
+          <w:docGrid w:linePitch="360"/>
+        </w:sectPr>
       </w:pPr>
     </w:p>
     <w:p>
@@ -4622,10 +4753,9 @@
       </w:tr>
     </w:tbl>
     <w:sectPr>
-      <w:headerReference w:type="default" r:id="rId6"/>
-      <w:footerReference w:type="default" r:id="rId7"/>
+      <w:footerReference w:type="default" r:id="rId6"/>
       <w:pgSz w:w="11906" w:h="16838" w:orient="portrait"/>
-      <w:pgMar w:top="2160" w:right="1440" w:bottom="1440" w:left="1440" w:header="708" w:footer="708" w:gutter="0"/>
+      <w:pgMar w:top="1440" w:right="1440" w:bottom="1440" w:left="1440" w:header="708" w:footer="708" w:gutter="0"/>
       <w:pgNumType/>
       <w:docGrid w:linePitch="360"/>
     </w:sectPr>
@@ -4707,56 +4837,6 @@
     </w:p>
   </w:footnote>
 </w:footnotes>
-</file>
-
-<file path=word/header1.xml><?xml version="1.0" encoding="utf-8"?>
-<w:hdr xmlns:wpc="http://schemas.microsoft.com/office/word/2010/wordprocessingCanvas" xmlns:mc="http://schemas.openxmlformats.org/markup-compatibility/2006" xmlns:o="urn:schemas-microsoft-com:office:office" xmlns:r="http://schemas.openxmlformats.org/officeDocument/2006/relationships" xmlns:m="http://schemas.openxmlformats.org/officeDocument/2006/math" xmlns:v="urn:schemas-microsoft-com:vml" xmlns:wp14="http://schemas.microsoft.com/office/word/2010/wordprocessingDrawing" xmlns:wp="http://schemas.openxmlformats.org/drawingml/2006/wordprocessingDrawing" xmlns:w10="urn:schemas-microsoft-com:office:word" xmlns:w="http://schemas.openxmlformats.org/wordprocessingml/2006/main" xmlns:w14="http://schemas.microsoft.com/office/word/2010/wordml" xmlns:w15="http://schemas.microsoft.com/office/word/2012/wordml" xmlns:wpg="http://schemas.microsoft.com/office/word/2010/wordprocessingGroup" xmlns:wpi="http://schemas.microsoft.com/office/word/2010/wordprocessingInk" xmlns:wne="http://schemas.microsoft.com/office/word/2006/wordml" xmlns:wps="http://schemas.microsoft.com/office/word/2010/wordprocessingShape" xmlns:cx="http://schemas.microsoft.com/office/drawing/2014/chartex" xmlns:cx1="http://schemas.microsoft.com/office/drawing/2015/9/8/chartex" xmlns:cx2="http://schemas.microsoft.com/office/drawing/2015/10/21/chartex" xmlns:cx3="http://schemas.microsoft.com/office/drawing/2016/5/9/chartex" xmlns:cx4="http://schemas.microsoft.com/office/drawing/2016/5/10/chartex" xmlns:cx5="http://schemas.microsoft.com/office/drawing/2016/5/11/chartex" xmlns:cx6="http://schemas.microsoft.com/office/drawing/2016/5/12/chartex" xmlns:cx7="http://schemas.microsoft.com/office/drawing/2016/5/13/chartex" xmlns:cx8="http://schemas.microsoft.com/office/drawing/2016/5/14/chartex" xmlns:w16cid="http://schemas.microsoft.com/office/word/2016/wordml/cid" xmlns:w16se="http://schemas.microsoft.com/office/word/2015/wordml/symex">
-  <w:p>
-    <w:pPr>
-      <w:spacing w:after="100"/>
-    </w:pPr>
-    <w:r>
-      <w:drawing>
-        <wp:inline distT="0" distB="0" distL="0" distR="0">
-          <wp:extent cx="1714500" cy="1333500"/>
-          <wp:effectExtent t="0" r="0" b="0" l="0"/>
-          <wp:docPr id="1" descr="Company logo" title="Peter Berkenbosch Consultancy"/>
-          <wp:cNvGraphicFramePr>
-            <a:graphicFrameLocks xmlns:a="http://schemas.openxmlformats.org/drawingml/2006/main" noChangeAspect="1"/>
-          </wp:cNvGraphicFramePr>
-          <a:graphic xmlns:a="http://schemas.openxmlformats.org/drawingml/2006/main">
-            <a:graphicData uri="http://schemas.openxmlformats.org/drawingml/2006/picture">
-              <pic:pic xmlns:pic="http://schemas.openxmlformats.org/drawingml/2006/picture">
-                <pic:nvPicPr>
-                  <pic:cNvPr id="0" name="" descr=""/>
-                  <pic:cNvPicPr>
-                    <a:picLocks noChangeAspect="1" noChangeArrowheads="1"/>
-                  </pic:cNvPicPr>
-                </pic:nvPicPr>
-                <pic:blipFill>
-                  <a:blip r:embed="rId0" cstate="none"/>
-                  <a:srcRect/>
-                  <a:stretch>
-                    <a:fillRect/>
-                  </a:stretch>
-                </pic:blipFill>
-                <pic:spPr bwMode="auto">
-                  <a:xfrm>
-                    <a:off x="0" y="0"/>
-                    <a:ext cx="1714500" cy="1333500"/>
-                  </a:xfrm>
-                  <a:prstGeom prst="rect">
-                    <a:avLst/>
-                  </a:prstGeom>
-                </pic:spPr>
-              </pic:pic>
-            </a:graphicData>
-          </a:graphic>
-        </wp:inline>
-      </w:drawing>
-    </w:r>
-  </w:p>
-</w:hdr>
 </file>
 
 <file path=word/numbering.xml><?xml version="1.0" encoding="utf-8"?>

</xml_diff>

<commit_message>
Cover page: trimmed hi-res logo, larger display, bolder party names
</commit_message>
<xml_diff>
--- a/artifacts/KTLO_Overeenkomst_Dienstverlening.docx
+++ b/artifacts/KTLO_Overeenkomst_Dienstverlening.docx
@@ -36,7 +36,7 @@
       <w:r>
         <w:drawing>
           <wp:inline distT="0" distB="0" distL="0" distR="0">
-            <wp:extent cx="2857500" cy="2219325"/>
+            <wp:extent cx="4286250" cy="1352550"/>
             <wp:effectExtent t="0" r="0" b="0" l="0"/>
             <wp:docPr id="1" descr="Company logo" title="Peter Berkenbosch Consultancy"/>
             <wp:cNvGraphicFramePr>
@@ -61,7 +61,7 @@
                   <pic:spPr bwMode="auto">
                     <a:xfrm>
                       <a:off x="0" y="0"/>
-                      <a:ext cx="2857500" cy="2219325"/>
+                      <a:ext cx="4286250" cy="1352550"/>
                     </a:xfrm>
                     <a:prstGeom prst="rect">
                       <a:avLst/>
@@ -128,8 +128,10 @@
       <w:r>
         <w:rPr>
           <w:rFonts w:ascii="Arial" w:cs="Arial" w:eastAsia="Arial" w:hAnsi="Arial"/>
-          <w:sz w:val="22"/>
-          <w:szCs w:val="22"/>
+          <w:b/>
+          <w:bCs/>
+          <w:sz w:val="28"/>
+          <w:szCs w:val="28"/>
         </w:rPr>
         <w:t xml:space="preserve">Peter Berkenbosch Consultancy B.V.</w:t>
       </w:r>
@@ -157,8 +159,10 @@
       <w:r>
         <w:rPr>
           <w:rFonts w:ascii="Arial" w:cs="Arial" w:eastAsia="Arial" w:hAnsi="Arial"/>
-          <w:sz w:val="22"/>
-          <w:szCs w:val="22"/>
+          <w:b/>
+          <w:bCs/>
+          <w:sz w:val="28"/>
+          <w:szCs w:val="28"/>
         </w:rPr>
         <w:t xml:space="preserve">Dinck B.V.</w:t>
       </w:r>

</xml_diff>

<commit_message>
Logo: SVG-rendered at 3000px for crisp PDF export
</commit_message>
<xml_diff>
--- a/artifacts/KTLO_Overeenkomst_Dienstverlening.docx
+++ b/artifacts/KTLO_Overeenkomst_Dienstverlening.docx
@@ -36,7 +36,7 @@
       <w:r>
         <w:drawing>
           <wp:inline distT="0" distB="0" distL="0" distR="0">
-            <wp:extent cx="4286250" cy="1352550"/>
+            <wp:extent cx="4476750" cy="1400175"/>
             <wp:effectExtent t="0" r="0" b="0" l="0"/>
             <wp:docPr id="1" descr="Company logo" title="Peter Berkenbosch Consultancy"/>
             <wp:cNvGraphicFramePr>
@@ -61,7 +61,7 @@
                   <pic:spPr bwMode="auto">
                     <a:xfrm>
                       <a:off x="0" y="0"/>
-                      <a:ext cx="4286250" cy="1352550"/>
+                      <a:ext cx="4476750" cy="1400175"/>
                     </a:xfrm>
                     <a:prstGeom prst="rect">
                       <a:avLst/>

</xml_diff>